<commit_message>
regenerated the litepaper docx
</commit_message>
<xml_diff>
--- a/litepaper/Orizon-Agents-Litepaper.docx
+++ b/litepaper/Orizon-Agents-Litepaper.docx
@@ -2310,7 +2310,7 @@
         <w:t xml:space="preserve"> </w:t>
       </w:r>
       <w:r>
-        <w:t xml:space="preserve">operation grants an escrow contract the right to draw up to a maximum amount, for a single workflow, before an expiry. Each step within the workflow triggers a</w:t>
+        <w:t xml:space="preserve">operation grants an escrow contract the right to draw up to a maximum amount, for a single workflow, before an expiry. The protocol then pays the agents without re-prompting the user. That payment is not live on testnet: the deployed escrow’s</w:t>
       </w:r>
       <w:r>
         <w:t xml:space="preserve"> </w:t>
@@ -2325,7 +2325,58 @@
         <w:t xml:space="preserve"> </w:t>
       </w:r>
       <w:r>
-        <w:t xml:space="preserve">that moves USDC from the buyer’s wallet to the agent owner’s wallet — without re-prompting the user. When the workflow ends, the buyer’s authorisation is consumed; whatever is unspent is returned by lapse.</w:t>
+        <w:t xml:space="preserve">cannot move the buyer’s funds on the settler’s signature alone, so no workflow has settled through it. Escrow v2, merged but not deployed, takes the funds into custody at</w:t>
+      </w:r>
+      <w:r>
+        <w:t xml:space="preserve"> </w:t>
+      </w:r>
+      <w:r>
+        <w:rPr>
+          <w:rStyle w:val="VerbatimChar"/>
+        </w:rPr>
+        <w:t xml:space="preserve">authorize</w:t>
+      </w:r>
+      <w:r>
+        <w:t xml:space="preserve"> </w:t>
+      </w:r>
+      <w:r>
+        <w:t xml:space="preserve">and, in one</w:t>
+      </w:r>
+      <w:r>
+        <w:t xml:space="preserve"> </w:t>
+      </w:r>
+      <w:r>
+        <w:rPr>
+          <w:rStyle w:val="VerbatimChar"/>
+        </w:rPr>
+        <w:t xml:space="preserve">settle</w:t>
+      </w:r>
+      <w:r>
+        <w:t xml:space="preserve">, pays each delivered step to its agent’s owner and returns the rest to the buyer (§6.8, §6.9; SC@dd2d642 · contract/payment-escrow/src/lib.rs ·</w:t>
+      </w:r>
+      <w:r>
+        <w:t xml:space="preserve"> </w:t>
+      </w:r>
+      <w:r>
+        <w:rPr>
+          <w:rStyle w:val="VerbatimChar"/>
+        </w:rPr>
+        <w:t xml:space="preserve">PaymentEscrow::authorize</w:t>
+      </w:r>
+      <w:r>
+        <w:t xml:space="preserve">,</w:t>
+      </w:r>
+      <w:r>
+        <w:t xml:space="preserve"> </w:t>
+      </w:r>
+      <w:r>
+        <w:rPr>
+          <w:rStyle w:val="VerbatimChar"/>
+        </w:rPr>
+        <w:t xml:space="preserve">PaymentEscrow::settle</w:t>
+      </w:r>
+      <w:r>
+        <w:t xml:space="preserve">).</w:t>
       </w:r>
     </w:p>
     <w:p>
@@ -2522,7 +2573,19 @@
         <w:t xml:space="preserve"> </w:t>
       </w:r>
       <w:r>
-        <w:t xml:space="preserve">two steps earlier without any out-of-band call. The same interface is used by twelve seeded agents and by future operator-supplied agents.</w:t>
+        <w:t xml:space="preserve">two steps earlier without any out-of-band call. The twelve seeded agents implement that interface inside the backend; an operator-supplied agent is reached at the HTTPS endpoint its owner binds, which the backend wraps in the same interface (§6.1, §6.3; BE@a3dc1f9 · app/services/binding_registry.py ·</w:t>
+      </w:r>
+      <w:r>
+        <w:t xml:space="preserve"> </w:t>
+      </w:r>
+      <w:r>
+        <w:rPr>
+          <w:rStyle w:val="VerbatimChar"/>
+        </w:rPr>
+        <w:t xml:space="preserve">resolve_worker</w:t>
+      </w:r>
+      <w:r>
+        <w:t xml:space="preserve">).</w:t>
       </w:r>
     </w:p>
     <w:p>
@@ -2678,7 +2741,7 @@
         <w:t xml:space="preserve"> </w:t>
       </w:r>
       <w:r>
-        <w:t xml:space="preserve">accumulates ratings per agent. The settler submits ratings after the workflow seals; a replay guard keyed by</w:t>
+        <w:t xml:space="preserve">accumulates ratings per agent. The scorer, which is the platform’s signing key and not the deployed escrow’s settler, submits one rating per step of a paid run; a replay guard keyed by</w:t>
       </w:r>
       <w:r>
         <w:t xml:space="preserve"> </w:t>
@@ -2693,7 +2756,7 @@
         <w:t xml:space="preserve"> </w:t>
       </w:r>
       <w:r>
-        <w:t xml:space="preserve">in temporary storage prevents double-counting. Reads are public: any client can query the rolling mean and the rating count for any agent, and any operator can use that signal to choose between agents at decompose time.</w:t>
+        <w:t xml:space="preserve">in persistent storage prevents double-counting (§6.1, §6.7). Reads are public: any client can query the decayed, value-weighted mean and the rating count for any agent, and any operator can use that signal to choose between agents at decompose time.</w:t>
       </w:r>
     </w:p>
     <w:bookmarkEnd w:id="27"/>
@@ -3783,7 +3846,27 @@
               <w:pStyle w:val="Compact"/>
             </w:pPr>
             <w:r>
-              <w:t xml:space="preserve">Planned</w:t>
+              <w:rPr>
+                <w:b/>
+                <w:bCs/>
+              </w:rPr>
+              <w:t xml:space="preserve">Live on testnet</w:t>
+            </w:r>
+            <w:r>
+              <w:t xml:space="preserve">: registration and reputation routing (§6.3, §6.7).</w:t>
+            </w:r>
+            <w:r>
+              <w:t xml:space="preserve"> </w:t>
+            </w:r>
+            <w:r>
+              <w:rPr>
+                <w:b/>
+                <w:bCs/>
+              </w:rPr>
+              <w:t xml:space="preserve">Merged, not deployed</w:t>
+            </w:r>
+            <w:r>
+              <w:t xml:space="preserve">: escrow v2, without which no dispute window opens on testnet (§6.8)</w:t>
             </w:r>
           </w:p>
         </w:tc>
@@ -4159,7 +4242,7 @@
         <w:rPr>
           <w:rStyle w:val="VerbatimChar"/>
         </w:rPr>
-        <w:t xml:space="preserve">PaymentEscrow.charge</w:t>
+        <w:t xml:space="preserve">PaymentEscrow</w:t>
       </w:r>
       <w:r>
         <w:t xml:space="preserve"> </w:t>
@@ -4180,7 +4263,85 @@
         <w:t xml:space="preserve"> </w:t>
       </w:r>
       <w:r>
-        <w:t xml:space="preserve">directly — six lines of Rust, one cross-contract hop, and the payment is final.</w:t>
+        <w:t xml:space="preserve">directly — one cross-contract hop. In the deployed v1 escrow that call sits in</w:t>
+      </w:r>
+      <w:r>
+        <w:t xml:space="preserve"> </w:t>
+      </w:r>
+      <w:r>
+        <w:rPr>
+          <w:rStyle w:val="VerbatimChar"/>
+        </w:rPr>
+        <w:t xml:space="preserve">charge</w:t>
+      </w:r>
+      <w:r>
+        <w:t xml:space="preserve"> </w:t>
+      </w:r>
+      <w:r>
+        <w:t xml:space="preserve">and cannot complete, because the transfer needs the buyer’s signature and the charge transaction carries only the settler’s; escrow v2, merged but not deployed, makes the transfer inside the buyer-signed</w:t>
+      </w:r>
+      <w:r>
+        <w:t xml:space="preserve"> </w:t>
+      </w:r>
+      <w:r>
+        <w:rPr>
+          <w:rStyle w:val="VerbatimChar"/>
+        </w:rPr>
+        <w:t xml:space="preserve">authorize</w:t>
+      </w:r>
+      <w:r>
+        <w:t xml:space="preserve">, into custody, and pays out from there at</w:t>
+      </w:r>
+      <w:r>
+        <w:t xml:space="preserve"> </w:t>
+      </w:r>
+      <w:r>
+        <w:rPr>
+          <w:rStyle w:val="VerbatimChar"/>
+        </w:rPr>
+        <w:t xml:space="preserve">settle</w:t>
+      </w:r>
+      <w:r>
+        <w:t xml:space="preserve"> </w:t>
+      </w:r>
+      <w:r>
+        <w:t xml:space="preserve">(§6.9; SC@88aa554 · contract/payment-escrow/src/lib.rs ·</w:t>
+      </w:r>
+      <w:r>
+        <w:t xml:space="preserve"> </w:t>
+      </w:r>
+      <w:r>
+        <w:rPr>
+          <w:rStyle w:val="VerbatimChar"/>
+        </w:rPr>
+        <w:t xml:space="preserve">PaymentEscrow::charge</w:t>
+      </w:r>
+      <w:r>
+        <w:t xml:space="preserve">; SC@dd2d642 · same file ·</w:t>
+      </w:r>
+      <w:r>
+        <w:t xml:space="preserve"> </w:t>
+      </w:r>
+      <w:r>
+        <w:rPr>
+          <w:rStyle w:val="VerbatimChar"/>
+        </w:rPr>
+        <w:t xml:space="preserve">PaymentEscrow::authorize</w:t>
+      </w:r>
+      <w:r>
+        <w:t xml:space="preserve">,</w:t>
+      </w:r>
+      <w:r>
+        <w:t xml:space="preserve"> </w:t>
+      </w:r>
+      <w:r>
+        <w:rPr>
+          <w:rStyle w:val="VerbatimChar"/>
+        </w:rPr>
+        <w:t xml:space="preserve">PaymentEscrow::settle</w:t>
+      </w:r>
+      <w:r>
+        <w:t xml:space="preserve">).</w:t>
       </w:r>
     </w:p>
     <w:p>
@@ -4235,7 +4396,22 @@
         <w:t xml:space="preserve">Temporary</w:t>
       </w:r>
       <w:r>
-        <w:t xml:space="preserve">) which lets us put the replay guard in</w:t>
+        <w:t xml:space="preserve">) which lets us keep the attestation and the rating replay guard in</w:t>
+      </w:r>
+      <w:r>
+        <w:t xml:space="preserve"> </w:t>
+      </w:r>
+      <w:r>
+        <w:rPr>
+          <w:rStyle w:val="VerbatimChar"/>
+        </w:rPr>
+        <w:t xml:space="preserve">Persistent</w:t>
+      </w:r>
+      <w:r>
+        <w:t xml:space="preserve"> </w:t>
+      </w:r>
+      <w:r>
+        <w:t xml:space="preserve">for good. The first ledger kept the replay guard in</w:t>
       </w:r>
       <w:r>
         <w:t xml:space="preserve"> </w:t>
@@ -4247,10 +4423,7 @@
         <w:t xml:space="preserve">Temporary</w:t>
       </w:r>
       <w:r>
-        <w:t xml:space="preserve"> </w:t>
-      </w:r>
-      <w:r>
-        <w:t xml:space="preserve">for free expiry and the attestation in</w:t>
+        <w:t xml:space="preserve">, where it expired and re-opened the replay window; the deployed ledger keeps it in</w:t>
       </w:r>
       <w:r>
         <w:t xml:space="preserve"> </w:t>
@@ -4265,7 +4438,19 @@
         <w:t xml:space="preserve"> </w:t>
       </w:r>
       <w:r>
-        <w:t xml:space="preserve">for forever. No external indexer is needed for events — Soroban RPC indexes them for us.</w:t>
+        <w:t xml:space="preserve">(SC@dd2d642 · contract/reputation-ledger/src/lib.rs ·</w:t>
+      </w:r>
+      <w:r>
+        <w:t xml:space="preserve"> </w:t>
+      </w:r>
+      <w:r>
+        <w:rPr>
+          <w:rStyle w:val="VerbatimChar"/>
+        </w:rPr>
+        <w:t xml:space="preserve">DataKey::Rated</w:t>
+      </w:r>
+      <w:r>
+        <w:t xml:space="preserve">). No external indexer is needed for events — Soroban RPC indexes them for us.</w:t>
       </w:r>
     </w:p>
     <w:p>
@@ -8431,7 +8616,7 @@
         <w:t xml:space="preserve">backend/app/seed.py</w:t>
       </w:r>
       <w:r>
-        <w:t xml:space="preserve">) with a price and a starting reputation.</w:t>
+        <w:t xml:space="preserve">) with a price and a starting reputation. The starting reputation is a display value; routing never reads it, and a seeded agent is floored on its on-chain evidence like any other (§6.2).</w:t>
       </w:r>
     </w:p>
     <w:p>
@@ -8463,52 +8648,37 @@
     </w:p>
     <w:p>
       <w:pPr>
-        <w:pStyle w:val="Compact"/>
-        <w:numPr>
-          <w:ilvl w:val="0"/>
-          <w:numId w:val="1018"/>
-        </w:numPr>
-      </w:pPr>
-      <w:r>
-        <w:t xml:space="preserve">Register the agent on chain by signing a</w:t>
-      </w:r>
-      <w:r>
-        <w:t xml:space="preserve"> </w:t>
-      </w:r>
-      <w:r>
-        <w:rPr>
-          <w:rStyle w:val="VerbatimChar"/>
-        </w:rPr>
-        <w:t xml:space="preserve">register(owner, id, name, skills, price)</w:t>
-      </w:r>
-      <w:r>
-        <w:t xml:space="preserve"> </w:t>
-      </w:r>
-      <w:r>
-        <w:t xml:space="preserve">XDR for the</w:t>
-      </w:r>
-      <w:r>
-        <w:t xml:space="preserve"> </w:t>
-      </w:r>
-      <w:r>
-        <w:rPr>
-          <w:rStyle w:val="VerbatimChar"/>
-        </w:rPr>
-        <w:t xml:space="preserve">AgentRegistry</w:t>
-      </w:r>
-      <w:r>
-        <w:t xml:space="preserve"> </w:t>
-      </w:r>
-      <w:r>
-        <w:t xml:space="preserve">contract.</w:t>
-      </w:r>
-    </w:p>
-    <w:p>
-      <w:pPr>
         <w:pStyle w:val="FirstParagraph"/>
       </w:pPr>
       <w:r>
-        <w:t xml:space="preserve">Step 4 is the only step that requires Stellar. Everything before it is plain Python.</w:t>
+        <w:t xml:space="preserve">None of this touches Stellar. A seeded agent is a backend record, not an on-chain registration: the seed set owns the</w:t>
+      </w:r>
+      <w:r>
+        <w:t xml:space="preserve"> </w:t>
+      </w:r>
+      <w:r>
+        <w:rPr>
+          <w:rStyle w:val="VerbatimChar"/>
+        </w:rPr>
+        <w:t xml:space="preserve">agt_</w:t>
+      </w:r>
+      <w:r>
+        <w:t xml:space="preserve"> </w:t>
+      </w:r>
+      <w:r>
+        <w:t xml:space="preserve">namespace, and the backend will not build a registration for such an id (§6.2; BE@a3dc1f9 · app/routers/stellar.py ·</w:t>
+      </w:r>
+      <w:r>
+        <w:t xml:space="preserve"> </w:t>
+      </w:r>
+      <w:r>
+        <w:rPr>
+          <w:rStyle w:val="VerbatimChar"/>
+        </w:rPr>
+        <w:t xml:space="preserve">build_register_agent</w:t>
+      </w:r>
+      <w:r>
+        <w:t xml:space="preserve">). This path is for contributors to the backend. An outside operator instead registers its own id on chain and binds an HTTPS endpoint (§6.3, §E.2).</w:t>
       </w:r>
     </w:p>
     <w:bookmarkEnd w:id="45"/>
@@ -10838,7 +11008,31 @@
         <w:pStyle w:val="FirstParagraph"/>
       </w:pPr>
       <w:r>
-        <w:t xml:space="preserve">For the free-form path, the orchestrator is a single Agno-wrapped chat agent whose system prompt is built from the live agent registry — every seeded agent’s id, name, skills, price, and rolling reputation is injected before the user’s intent. The agent returns a</w:t>
+        <w:t xml:space="preserve">For the free-form path, the orchestrator is a single Agno-wrapped chat agent whose system prompt is built from the live agent registry — every routable agent’s id, name, skills, price, and reputation is injected before the user’s intent. Routable means listed, dispatchable and above the reputation floor, seeded or registered alike (§6.3, §6.7), and the reputation shown is the prior-smoothed on-chain score on a 0–5 display scale, never a seeded or self-declared value (BE@a3dc1f9 · app/services/orchestrator_svc.py ·</w:t>
+      </w:r>
+      <w:r>
+        <w:t xml:space="preserve"> </w:t>
+      </w:r>
+      <w:r>
+        <w:rPr>
+          <w:rStyle w:val="VerbatimChar"/>
+        </w:rPr>
+        <w:t xml:space="preserve">_routable_registry</w:t>
+      </w:r>
+      <w:r>
+        <w:t xml:space="preserve">,</w:t>
+      </w:r>
+      <w:r>
+        <w:t xml:space="preserve"> </w:t>
+      </w:r>
+      <w:r>
+        <w:rPr>
+          <w:rStyle w:val="VerbatimChar"/>
+        </w:rPr>
+        <w:t xml:space="preserve">_smoothed_score</w:t>
+      </w:r>
+      <w:r>
+        <w:t xml:space="preserve">). The agent returns a</w:t>
       </w:r>
       <w:r>
         <w:t xml:space="preserve"> </w:t>
@@ -14368,7 +14562,7 @@
               <w:pStyle w:val="Compact"/>
             </w:pPr>
             <w:r>
-              <w:t xml:space="preserve">Rolling-mean rating per agent with replay guard</w:t>
+              <w:t xml:space="preserve">Decayed, value-weighted rating evidence per agent, 0–10,000 bps, with replay guard</w:t>
             </w:r>
           </w:p>
         </w:tc>
@@ -14679,7 +14873,7 @@
         <w:t xml:space="preserve"> </w:t>
       </w:r>
       <w:r>
-        <w:t xml:space="preserve">are write paths for the settler and public read paths for everyone else.</w:t>
+        <w:t xml:space="preserve">are write paths for the sealer and the scorer and public read paths for everyone else. The diagram draws one protocol key; on testnet the sealer and the scorer are the backend’s signing key, and the deployed escrow’s settler is the admin key (§6.1).</w:t>
       </w:r>
     </w:p>
     <w:p>
@@ -14714,7 +14908,7 @@
         <w:t xml:space="preserve">auth_id</w:t>
       </w:r>
       <w:r>
-        <w:t xml:space="preserve">. The settler (the protocol’s backend) calls</w:t>
+        <w:t xml:space="preserve">. The settler calls</w:t>
       </w:r>
       <w:r>
         <w:t xml:space="preserve"> </w:t>
@@ -14726,10 +14920,7 @@
         <w:t xml:space="preserve">charge(caller, auth_id, amount, job_id)</w:t>
       </w:r>
       <w:r>
-        <w:t xml:space="preserve"> </w:t>
-      </w:r>
-      <w:r>
-        <w:t xml:space="preserve">per step, which validates the authorisation, looks up the agent owner via</w:t>
+        <w:t xml:space="preserve">, which validates the authorisation, looks up the agent owner via</w:t>
       </w:r>
       <w:r>
         <w:t xml:space="preserve"> </w:t>
@@ -14753,7 +14944,46 @@
         <w:t xml:space="preserve">Token::transfer</w:t>
       </w:r>
       <w:r>
-        <w:t xml:space="preserve">. The settler calls</w:t>
+        <w:t xml:space="preserve">. On the deployed escrow the settler is the admin key, not the backend’s, and that transfer cannot complete, because it needs the buyer’s signature, which the charge transaction does not carry (§6.1, §6.9; SC@88aa554 · contract/payment-escrow/src/lib.rs ·</w:t>
+      </w:r>
+      <w:r>
+        <w:t xml:space="preserve"> </w:t>
+      </w:r>
+      <w:r>
+        <w:rPr>
+          <w:rStyle w:val="VerbatimChar"/>
+        </w:rPr>
+        <w:t xml:space="preserve">PaymentEscrow::charge</w:t>
+      </w:r>
+      <w:r>
+        <w:t xml:space="preserve">). The backend submits one</w:t>
+      </w:r>
+      <w:r>
+        <w:t xml:space="preserve"> </w:t>
+      </w:r>
+      <w:r>
+        <w:rPr>
+          <w:rStyle w:val="VerbatimChar"/>
+        </w:rPr>
+        <w:t xml:space="preserve">charge</w:t>
+      </w:r>
+      <w:r>
+        <w:t xml:space="preserve"> </w:t>
+      </w:r>
+      <w:r>
+        <w:t xml:space="preserve">for the workflow’s total (BE@a3dc1f9 · app/services/execution_svc.py ·</w:t>
+      </w:r>
+      <w:r>
+        <w:t xml:space="preserve"> </w:t>
+      </w:r>
+      <w:r>
+        <w:rPr>
+          <w:rStyle w:val="VerbatimChar"/>
+        </w:rPr>
+        <w:t xml:space="preserve">_settle_onchain</w:t>
+      </w:r>
+      <w:r>
+        <w:t xml:space="preserve">). The sealer calls</w:t>
       </w:r>
       <w:r>
         <w:t xml:space="preserve"> </w:t>
@@ -14810,16 +15040,16 @@
         <w:t xml:space="preserve">AlreadyExists</w:t>
       </w:r>
       <w:r>
-        <w:t xml:space="preserve">. A scorer calls</w:t>
-      </w:r>
-      <w:r>
-        <w:t xml:space="preserve"> </w:t>
-      </w:r>
-      <w:r>
-        <w:rPr>
-          <w:rStyle w:val="VerbatimChar"/>
-        </w:rPr>
-        <w:t xml:space="preserve">submit(caller, agent_id, rating, job_id)</w:t>
+        <w:t xml:space="preserve">. The scorer calls</w:t>
+      </w:r>
+      <w:r>
+        <w:t xml:space="preserve"> </w:t>
+      </w:r>
+      <w:r>
+        <w:rPr>
+          <w:rStyle w:val="VerbatimChar"/>
+        </w:rPr>
+        <w:t xml:space="preserve">submit(caller, agent_id, job_id, rating_0_to_100, weight, payer, kind)</w:t>
       </w:r>
       <w:r>
         <w:t xml:space="preserve"> </w:t>
@@ -14852,7 +15082,7 @@
         <w:t xml:space="preserve"> </w:t>
       </w:r>
       <w:r>
-        <w:t xml:space="preserve">temporary-storage key guarding against replay.</w:t>
+        <w:t xml:space="preserve">persistent-storage key guarding against replay. The sealer and the scorer are the backend’s signing key on testnet (§6.1).</w:t>
       </w:r>
     </w:p>
     <w:bookmarkStart w:id="59" w:name="contract-apis-verbatim"/>
@@ -16396,16 +16626,16 @@
         <w:t xml:space="preserve"> </w:t>
       </w:r>
       <w:r>
-        <w:t xml:space="preserve">— rolling-mean rating per agent. Storage keyed by</w:t>
-      </w:r>
-      <w:r>
-        <w:t xml:space="preserve"> </w:t>
-      </w:r>
-      <w:r>
-        <w:rPr>
-          <w:rStyle w:val="VerbatimChar"/>
-        </w:rPr>
-        <w:t xml:space="preserve">Score(Symbol)</w:t>
+        <w:t xml:space="preserve">— decayed, value-weighted rating evidence per agent, on a 0–10,000 basis-point scale. Storage keyed by</w:t>
+      </w:r>
+      <w:r>
+        <w:t xml:space="preserve"> </w:t>
+      </w:r>
+      <w:r>
+        <w:rPr>
+          <w:rStyle w:val="VerbatimChar"/>
+        </w:rPr>
+        <w:t xml:space="preserve">Rep(Symbol)</w:t>
       </w:r>
       <w:r>
         <w:t xml:space="preserve"> </w:t>
@@ -16426,7 +16656,31 @@
         <w:t xml:space="preserve"> </w:t>
       </w:r>
       <w:r>
-        <w:t xml:space="preserve">(temporary tier) for the replay guard.</w:t>
+        <w:t xml:space="preserve">(persistent tier) for the replay guard (SC@dd2d642 · contract/reputation-ledger/src/lib.rs ·</w:t>
+      </w:r>
+      <w:r>
+        <w:t xml:space="preserve"> </w:t>
+      </w:r>
+      <w:r>
+        <w:rPr>
+          <w:rStyle w:val="VerbatimChar"/>
+        </w:rPr>
+        <w:t xml:space="preserve">ReputationLedger</w:t>
+      </w:r>
+      <w:r>
+        <w:t xml:space="preserve">,</w:t>
+      </w:r>
+      <w:r>
+        <w:t xml:space="preserve"> </w:t>
+      </w:r>
+      <w:r>
+        <w:rPr>
+          <w:rStyle w:val="VerbatimChar"/>
+        </w:rPr>
+        <w:t xml:space="preserve">DataKey</w:t>
+      </w:r>
+      <w:r>
+        <w:t xml:space="preserve">).</w:t>
       </w:r>
     </w:p>
     <w:tbl>
@@ -16568,7 +16822,7 @@
               <w:rPr>
                 <w:rStyle w:val="VerbatimChar"/>
               </w:rPr>
-              <w:t xml:space="preserve">(env, caller, agent_id, rating_0_to_5, job_id) → Result&lt;(), Error&gt;</w:t>
+              <w:t xml:space="preserve">(env, caller, agent_id, job_id, rating_0_to_100, weight, payer, kind) → Result&lt;(), Error&gt;</w:t>
             </w:r>
           </w:p>
         </w:tc>
@@ -16590,7 +16844,22 @@
               <w:pStyle w:val="Compact"/>
             </w:pPr>
             <w:r>
-              <w:t xml:space="preserve">Step 4; errs</w:t>
+              <w:t xml:space="preserve">Step 4; stores the rating as</w:t>
+            </w:r>
+            <w:r>
+              <w:t xml:space="preserve"> </w:t>
+            </w:r>
+            <w:r>
+              <w:rPr>
+                <w:rStyle w:val="VerbatimChar"/>
+              </w:rPr>
+              <w:t xml:space="preserve">rating_0_to_100 × 100</w:t>
+            </w:r>
+            <w:r>
+              <w:t xml:space="preserve"> </w:t>
+            </w:r>
+            <w:r>
+              <w:t xml:space="preserve">bps, weighted by the job’s value; errs</w:t>
             </w:r>
             <w:r>
               <w:t xml:space="preserve"> </w:t>
@@ -16635,7 +16904,7 @@
               <w:t xml:space="preserve"> </w:t>
             </w:r>
             <w:r>
-              <w:t xml:space="preserve">if rating &gt; 5</w:t>
+              <w:t xml:space="preserve">if rating &gt; 100 or the weight is outside 0 &lt; weight ≤ 100 USDC</w:t>
             </w:r>
           </w:p>
         </w:tc>
@@ -16651,7 +16920,7 @@
               <w:rPr>
                 <w:rStyle w:val="VerbatimChar"/>
               </w:rPr>
-              <w:t xml:space="preserve">score</w:t>
+              <w:t xml:space="preserve">rep_state</w:t>
             </w:r>
           </w:p>
         </w:tc>
@@ -16665,7 +16934,7 @@
               <w:rPr>
                 <w:rStyle w:val="VerbatimChar"/>
               </w:rPr>
-              <w:t xml:space="preserve">(env, agent_id) → Score</w:t>
+              <w:t xml:space="preserve">(env, agent_id) → RepState</w:t>
             </w:r>
           </w:p>
         </w:tc>
@@ -16687,7 +16956,7 @@
               <w:pStyle w:val="Compact"/>
             </w:pPr>
             <w:r>
-              <w:t xml:space="preserve">Raw</w:t>
+              <w:t xml:space="preserve">Raw evidence</w:t>
             </w:r>
             <w:r>
               <w:t xml:space="preserve"> </w:t>
@@ -16696,13 +16965,10 @@
               <w:rPr>
                 <w:rStyle w:val="VerbatimChar"/>
               </w:rPr>
-              <w:t xml:space="preserve">{sum, count}</w:t>
-            </w:r>
-            <w:r>
-              <w:t xml:space="preserve"> </w:t>
-            </w:r>
-            <w:r>
-              <w:t xml:space="preserve">for the agent</w:t>
+              <w:t xml:space="preserve">{sum_w, weight, count, disputed, last_epoch}</w:t>
+            </w:r>
+            <w:r>
+              <w:t xml:space="preserve">, decayed to now</w:t>
             </w:r>
           </w:p>
         </w:tc>
@@ -16754,7 +17020,172 @@
               <w:pStyle w:val="Compact"/>
             </w:pPr>
             <w:r>
-              <w:t xml:space="preserve">Rolling mean × 10 000 (basis points); 0 if no ratings yet</w:t>
+              <w:t xml:space="preserve">Decayed, weighted mean in basis points, clamped to 0..10,000; 0 if no ratings yet</w:t>
+            </w:r>
+          </w:p>
+        </w:tc>
+      </w:tr>
+      <w:tr>
+        <w:tc>
+          <w:tcPr/>
+          <w:p>
+            <w:pPr>
+              <w:pStyle w:val="Compact"/>
+            </w:pPr>
+            <w:r>
+              <w:rPr>
+                <w:rStyle w:val="VerbatimChar"/>
+              </w:rPr>
+              <w:t xml:space="preserve">rep_bps</w:t>
+            </w:r>
+          </w:p>
+        </w:tc>
+        <w:tc>
+          <w:tcPr/>
+          <w:p>
+            <w:pPr>
+              <w:pStyle w:val="Compact"/>
+            </w:pPr>
+            <w:r>
+              <w:rPr>
+                <w:rStyle w:val="VerbatimChar"/>
+              </w:rPr>
+              <w:t xml:space="preserve">(env, agent_id, prior_bps, prior_weight) → u32</w:t>
+            </w:r>
+          </w:p>
+        </w:tc>
+        <w:tc>
+          <w:tcPr/>
+          <w:p>
+            <w:pPr>
+              <w:pStyle w:val="Compact"/>
+            </w:pPr>
+            <w:r>
+              <w:t xml:space="preserve">public</w:t>
+            </w:r>
+          </w:p>
+        </w:tc>
+        <w:tc>
+          <w:tcPr/>
+          <w:p>
+            <w:pPr>
+              <w:pStyle w:val="Compact"/>
+            </w:pPr>
+            <w:r>
+              <w:t xml:space="preserve">The mean smoothed by a caller-supplied prior, clamped to 0..10,000</w:t>
+            </w:r>
+          </w:p>
+        </w:tc>
+      </w:tr>
+      <w:tr>
+        <w:tc>
+          <w:tcPr/>
+          <w:p>
+            <w:pPr>
+              <w:pStyle w:val="Compact"/>
+            </w:pPr>
+            <w:r>
+              <w:rPr>
+                <w:rStyle w:val="VerbatimChar"/>
+              </w:rPr>
+              <w:t xml:space="preserve">dispute_rate_bps</w:t>
+            </w:r>
+          </w:p>
+        </w:tc>
+        <w:tc>
+          <w:tcPr/>
+          <w:p>
+            <w:pPr>
+              <w:pStyle w:val="Compact"/>
+            </w:pPr>
+            <w:r>
+              <w:rPr>
+                <w:rStyle w:val="VerbatimChar"/>
+              </w:rPr>
+              <w:t xml:space="preserve">(env, agent_id) → u32</w:t>
+            </w:r>
+          </w:p>
+        </w:tc>
+        <w:tc>
+          <w:tcPr/>
+          <w:p>
+            <w:pPr>
+              <w:pStyle w:val="Compact"/>
+            </w:pPr>
+            <w:r>
+              <w:t xml:space="preserve">public</w:t>
+            </w:r>
+          </w:p>
+        </w:tc>
+        <w:tc>
+          <w:tcPr/>
+          <w:p>
+            <w:pPr>
+              <w:pStyle w:val="Compact"/>
+            </w:pPr>
+            <w:r>
+              <w:t xml:space="preserve">Lifetime</w:t>
+            </w:r>
+            <w:r>
+              <w:t xml:space="preserve"> </w:t>
+            </w:r>
+            <w:r>
+              <w:rPr>
+                <w:rStyle w:val="VerbatimChar"/>
+              </w:rPr>
+              <w:t xml:space="preserve">disputed × 10,000 / count</w:t>
+            </w:r>
+          </w:p>
+        </w:tc>
+      </w:tr>
+      <w:tr>
+        <w:tc>
+          <w:tcPr/>
+          <w:p>
+            <w:pPr>
+              <w:pStyle w:val="Compact"/>
+            </w:pPr>
+            <w:r>
+              <w:rPr>
+                <w:rStyle w:val="VerbatimChar"/>
+              </w:rPr>
+              <w:t xml:space="preserve">payer_weight</w:t>
+            </w:r>
+          </w:p>
+        </w:tc>
+        <w:tc>
+          <w:tcPr/>
+          <w:p>
+            <w:pPr>
+              <w:pStyle w:val="Compact"/>
+            </w:pPr>
+            <w:r>
+              <w:rPr>
+                <w:rStyle w:val="VerbatimChar"/>
+              </w:rPr>
+              <w:t xml:space="preserve">(env, agent_id, payer) → i128</w:t>
+            </w:r>
+          </w:p>
+        </w:tc>
+        <w:tc>
+          <w:tcPr/>
+          <w:p>
+            <w:pPr>
+              <w:pStyle w:val="Compact"/>
+            </w:pPr>
+            <w:r>
+              <w:t xml:space="preserve">public</w:t>
+            </w:r>
+          </w:p>
+        </w:tc>
+        <w:tc>
+          <w:tcPr/>
+          <w:p>
+            <w:pPr>
+              <w:pStyle w:val="Compact"/>
+            </w:pPr>
+            <w:r>
+              <w:t xml:space="preserve">Cumulative weight one payer has contributed to the agent</w:t>
             </w:r>
           </w:p>
         </w:tc>
@@ -17484,7 +17915,52 @@
         <w:t xml:space="preserve"> </w:t>
       </w:r>
       <w:r>
-        <w:t xml:space="preserve">The x402 flow as actually executed across the four contracts and the asset SAC.</w:t>
+        <w:t xml:space="preserve">The x402 flow as the deployed v1 contracts are written, across the four contracts and the asset SAC. On testnet the</w:t>
+      </w:r>
+      <w:r>
+        <w:t xml:space="preserve"> </w:t>
+      </w:r>
+      <w:r>
+        <w:rPr>
+          <w:rStyle w:val="VerbatimChar"/>
+        </w:rPr>
+        <w:t xml:space="preserve">Token::transfer</w:t>
+      </w:r>
+      <w:r>
+        <w:t xml:space="preserve"> </w:t>
+      </w:r>
+      <w:r>
+        <w:t xml:space="preserve">step fails, because the buyer’s signature is not in the charge transaction, so no charge has completed through the deployed escrow; escrow v2, merged but not deployed, takes custody at</w:t>
+      </w:r>
+      <w:r>
+        <w:t xml:space="preserve"> </w:t>
+      </w:r>
+      <w:r>
+        <w:rPr>
+          <w:rStyle w:val="VerbatimChar"/>
+        </w:rPr>
+        <w:t xml:space="preserve">authorize</w:t>
+      </w:r>
+      <w:r>
+        <w:t xml:space="preserve"> </w:t>
+      </w:r>
+      <w:r>
+        <w:t xml:space="preserve">and pays out in one</w:t>
+      </w:r>
+      <w:r>
+        <w:t xml:space="preserve"> </w:t>
+      </w:r>
+      <w:r>
+        <w:rPr>
+          <w:rStyle w:val="VerbatimChar"/>
+        </w:rPr>
+        <w:t xml:space="preserve">settle</w:t>
+      </w:r>
+      <w:r>
+        <w:t xml:space="preserve"> </w:t>
+      </w:r>
+      <w:r>
+        <w:t xml:space="preserve">(§6.8, §6.9).</w:t>
       </w:r>
     </w:p>
     <w:p>
@@ -17811,7 +18287,7 @@
         <w:t xml:space="preserve"> </w:t>
       </w:r>
       <w:r>
-        <w:t xml:space="preserve">per workflow, optional</w:t>
+        <w:t xml:space="preserve">per workflow, one</w:t>
       </w:r>
       <w:r>
         <w:t xml:space="preserve"> </w:t>
@@ -17826,7 +18302,7 @@
         <w:t xml:space="preserve"> </w:t>
       </w:r>
       <w:r>
-        <w:t xml:space="preserve">markers in temporary storage that lapse with the network TTL.</w:t>
+        <w:t xml:space="preserve">marker per rating in persistent storage, which does not lapse.</w:t>
       </w:r>
     </w:p>
     <w:bookmarkEnd w:id="66"/>
@@ -17953,7 +18429,37 @@
         <w:t xml:space="preserve"> </w:t>
       </w:r>
       <w:r>
-        <w:t xml:space="preserve">The backend holds a separate signing key with one job — countersigning</w:t>
+        <w:t xml:space="preserve">The</w:t>
+      </w:r>
+      <w:r>
+        <w:t xml:space="preserve"> </w:t>
+      </w:r>
+      <w:r>
+        <w:rPr>
+          <w:rStyle w:val="VerbatimChar"/>
+        </w:rPr>
+        <w:t xml:space="preserve">Settler</w:t>
+      </w:r>
+      <w:r>
+        <w:t xml:space="preserve"> </w:t>
+      </w:r>
+      <w:r>
+        <w:t xml:space="preserve">storage slot in</w:t>
+      </w:r>
+      <w:r>
+        <w:t xml:space="preserve"> </w:t>
+      </w:r>
+      <w:r>
+        <w:rPr>
+          <w:rStyle w:val="VerbatimChar"/>
+        </w:rPr>
+        <w:t xml:space="preserve">PaymentEscrow</w:t>
+      </w:r>
+      <w:r>
+        <w:t xml:space="preserve"> </w:t>
+      </w:r>
+      <w:r>
+        <w:t xml:space="preserve">is the only address allowed to call</w:t>
       </w:r>
       <w:r>
         <w:t xml:space="preserve"> </w:t>
@@ -17968,64 +18474,55 @@
         <w:t xml:space="preserve"> </w:t>
       </w:r>
       <w:r>
-        <w:t xml:space="preserve">and</w:t>
-      </w:r>
-      <w:r>
-        <w:t xml:space="preserve"> </w:t>
-      </w:r>
-      <w:r>
-        <w:rPr>
-          <w:rStyle w:val="VerbatimChar"/>
-        </w:rPr>
-        <w:t xml:space="preserve">seal</w:t>
-      </w:r>
-      <w:r>
-        <w:t xml:space="preserve"> </w:t>
-      </w:r>
-      <w:r>
-        <w:t xml:space="preserve">XDR for workflows the buyer has already authorised. The</w:t>
-      </w:r>
-      <w:r>
-        <w:t xml:space="preserve"> </w:t>
-      </w:r>
-      <w:r>
-        <w:rPr>
-          <w:rStyle w:val="VerbatimChar"/>
-        </w:rPr>
-        <w:t xml:space="preserve">Settler</w:t>
-      </w:r>
-      <w:r>
-        <w:t xml:space="preserve"> </w:t>
-      </w:r>
-      <w:r>
-        <w:t xml:space="preserve">storage slot in</w:t>
-      </w:r>
-      <w:r>
-        <w:t xml:space="preserve"> </w:t>
-      </w:r>
-      <w:r>
-        <w:rPr>
-          <w:rStyle w:val="VerbatimChar"/>
-        </w:rPr>
-        <w:t xml:space="preserve">PaymentEscrow</w:t>
-      </w:r>
-      <w:r>
-        <w:t xml:space="preserve"> </w:t>
-      </w:r>
-      <w:r>
-        <w:t xml:space="preserve">is the only address allowed to call</w:t>
-      </w:r>
-      <w:r>
-        <w:t xml:space="preserve"> </w:t>
-      </w:r>
-      <w:r>
-        <w:rPr>
-          <w:rStyle w:val="VerbatimChar"/>
-        </w:rPr>
-        <w:t xml:space="preserve">charge</w:t>
-      </w:r>
-      <w:r>
-        <w:t xml:space="preserve">. The buyer’s authorisation enforces both a per-workflow maximum spend and a wall-clock expiry; the settler cannot exceed either.</w:t>
+        <w:t xml:space="preserve">(SC@88aa554 · contract/payment-escrow/src/lib.rs ·</w:t>
+      </w:r>
+      <w:r>
+        <w:t xml:space="preserve"> </w:t>
+      </w:r>
+      <w:r>
+        <w:rPr>
+          <w:rStyle w:val="VerbatimChar"/>
+        </w:rPr>
+        <w:t xml:space="preserve">PaymentEscrow::charge</w:t>
+      </w:r>
+      <w:r>
+        <w:t xml:space="preserve">). On the deployed escrow that settler is the admin key,</w:t>
+      </w:r>
+      <w:r>
+        <w:t xml:space="preserve"> </w:t>
+      </w:r>
+      <w:r>
+        <w:rPr>
+          <w:rStyle w:val="VerbatimChar"/>
+        </w:rPr>
+        <w:t xml:space="preserve">GA7AI5…5OQV</w:t>
+      </w:r>
+      <w:r>
+        <w:t xml:space="preserve">. The backend’s own signing key,</w:t>
+      </w:r>
+      <w:r>
+        <w:t xml:space="preserve"> </w:t>
+      </w:r>
+      <w:r>
+        <w:rPr>
+          <w:rStyle w:val="VerbatimChar"/>
+        </w:rPr>
+        <w:t xml:space="preserve">GDB4N2…CDHP</w:t>
+      </w:r>
+      <w:r>
+        <w:t xml:space="preserve">, is a different key: it writes ratings (scorer), seals attestations (sealer) and pays dispute credits, and it becomes the escrow’s settler only once escrow v2 is deployed (§6.1; BE@a3dc1f9 · app/config.py ·</w:t>
+      </w:r>
+      <w:r>
+        <w:t xml:space="preserve"> </w:t>
+      </w:r>
+      <w:r>
+        <w:rPr>
+          <w:rStyle w:val="VerbatimChar"/>
+        </w:rPr>
+        <w:t xml:space="preserve">stellar_signing_key</w:t>
+      </w:r>
+      <w:r>
+        <w:t xml:space="preserve">). The buyer’s authorisation enforces both a per-workflow maximum spend and a wall-clock expiry; the settler cannot exceed either.</w:t>
       </w:r>
     </w:p>
     <w:p>
@@ -18205,7 +18702,7 @@
         <w:t xml:space="preserve"> </w:t>
       </w:r>
       <w:r>
-        <w:t xml:space="preserve">marker in temporary storage. Two ratings for the same</w:t>
+        <w:t xml:space="preserve">marker in persistent storage. A second rating for the same</w:t>
       </w:r>
       <w:r>
         <w:t xml:space="preserve"> </w:t>
@@ -18220,7 +18717,7 @@
         <w:t xml:space="preserve"> </w:t>
       </w:r>
       <w:r>
-        <w:t xml:space="preserve">pair within the network TTL window are rejected with</w:t>
+        <w:t xml:space="preserve">pair is rejected with</w:t>
       </w:r>
       <w:r>
         <w:t xml:space="preserve"> </w:t>
@@ -18232,7 +18729,31 @@
         <w:t xml:space="preserve">Error::Replay</w:t>
       </w:r>
       <w:r>
-        <w:t xml:space="preserve">. The temporary storage tier means the marker eventually lapses — but by then the cost of re-rating is negligible because both the original rating and any future rating are public.</w:t>
+        <w:t xml:space="preserve">, however much later it comes; the marker does not lapse (SC@dd2d642 · contract/reputation-ledger/src/lib.rs ·</w:t>
+      </w:r>
+      <w:r>
+        <w:t xml:space="preserve"> </w:t>
+      </w:r>
+      <w:r>
+        <w:rPr>
+          <w:rStyle w:val="VerbatimChar"/>
+        </w:rPr>
+        <w:t xml:space="preserve">ReputationLedger::submit</w:t>
+      </w:r>
+      <w:r>
+        <w:t xml:space="preserve">,</w:t>
+      </w:r>
+      <w:r>
+        <w:t xml:space="preserve"> </w:t>
+      </w:r>
+      <w:r>
+        <w:rPr>
+          <w:rStyle w:val="VerbatimChar"/>
+        </w:rPr>
+        <w:t xml:space="preserve">DataKey::Rated</w:t>
+      </w:r>
+      <w:r>
+        <w:t xml:space="preserve">).</w:t>
       </w:r>
     </w:p>
     <w:p>
@@ -18489,7 +19010,19 @@
               <w:pStyle w:val="Compact"/>
             </w:pPr>
             <w:r>
-              <w:t xml:space="preserve">Backend host compromise</w:t>
+              <w:t xml:space="preserve">Theft of the settler key: on testnet the admin key,</w:t>
+            </w:r>
+            <w:r>
+              <w:t xml:space="preserve"> </w:t>
+            </w:r>
+            <w:r>
+              <w:rPr>
+                <w:rStyle w:val="VerbatimChar"/>
+              </w:rPr>
+              <w:t xml:space="preserve">GA7AI5…5OQV</w:t>
+            </w:r>
+            <w:r>
+              <w:t xml:space="preserve">; once escrow v2 is deployed, the backend’s signing key on its host (§6.1)</w:t>
             </w:r>
           </w:p>
         </w:tc>
@@ -18527,7 +19060,19 @@
               <w:t xml:space="preserve">expires_at</w:t>
             </w:r>
             <w:r>
-              <w:t xml:space="preserve">; admin can rotate via</w:t>
+              <w:t xml:space="preserve">. The deployed escrow writes its settler once, in the constructor, and has no setter, so replacing it means deploying a new escrow (SC@88aa554 · contract/payment-escrow/src/lib.rs ·</w:t>
+            </w:r>
+            <w:r>
+              <w:t xml:space="preserve"> </w:t>
+            </w:r>
+            <w:r>
+              <w:rPr>
+                <w:rStyle w:val="VerbatimChar"/>
+              </w:rPr>
+              <w:t xml:space="preserve">PaymentEscrow::__constructor</w:t>
+            </w:r>
+            <w:r>
+              <w:t xml:space="preserve">); escrow v2, merged but not deployed, adds an admin-only</w:t>
             </w:r>
             <w:r>
               <w:t xml:space="preserve"> </w:t>
@@ -18542,7 +19087,19 @@
               <w:t xml:space="preserve"> </w:t>
             </w:r>
             <w:r>
-              <w:t xml:space="preserve">/</w:t>
+              <w:t xml:space="preserve">(SC@dd2d642 · contract/payment-escrow/src/lib.rs ·</w:t>
+            </w:r>
+            <w:r>
+              <w:t xml:space="preserve"> </w:t>
+            </w:r>
+            <w:r>
+              <w:rPr>
+                <w:rStyle w:val="VerbatimChar"/>
+              </w:rPr>
+              <w:t xml:space="preserve">PaymentEscrow::set_settler</w:t>
+            </w:r>
+            <w:r>
+              <w:t xml:space="preserve">). The admin can rotate the sealer and the scorer via</w:t>
             </w:r>
             <w:r>
               <w:t xml:space="preserve"> </w:t>
@@ -18893,7 +19450,7 @@
               <w:t xml:space="preserve"> </w:t>
             </w:r>
             <w:r>
-              <w:t xml:space="preserve">marker in temporary storage; second</w:t>
+              <w:t xml:space="preserve">marker in persistent storage; second</w:t>
             </w:r>
             <w:r>
               <w:t xml:space="preserve"> </w:t>
@@ -18928,7 +19485,19 @@
               <w:pStyle w:val="Compact"/>
             </w:pPr>
             <w:r>
-              <w:t xml:space="preserve">Replay window equals temporary-storage TTL (~6–10 h). After that the marker lapses but both ratings (original + replay) are public, so the cost of replaying is visible</w:t>
+              <w:t xml:space="preserve">None at the contract: the marker does not lapse. A scorer can still rate the same agent under a fresh</w:t>
+            </w:r>
+            <w:r>
+              <w:t xml:space="preserve"> </w:t>
+            </w:r>
+            <w:r>
+              <w:rPr>
+                <w:rStyle w:val="VerbatimChar"/>
+              </w:rPr>
+              <w:t xml:space="preserve">job_id</w:t>
+            </w:r>
+            <w:r>
+              <w:t xml:space="preserve">, which is why only the scorer can rate</w:t>
             </w:r>
           </w:p>
         </w:tc>
@@ -21282,22 +21851,7 @@
         <w:pStyle w:val="FirstParagraph"/>
       </w:pPr>
       <w:r>
-        <w:t xml:space="preserve">Today the agent registry is seeded by the protocol team. Registration is technically permissionless (anyone can sign a</w:t>
-      </w:r>
-      <w:r>
-        <w:t xml:space="preserve"> </w:t>
-      </w:r>
-      <w:r>
-        <w:rPr>
-          <w:rStyle w:val="VerbatimChar"/>
-        </w:rPr>
-        <w:t xml:space="preserve">register</w:t>
-      </w:r>
-      <w:r>
-        <w:t xml:space="preserve"> </w:t>
-      </w:r>
-      <w:r>
-        <w:t xml:space="preserve">XDR), but the orchestrator’s planning prompt knows only about seeded agents. In the</w:t>
+        <w:t xml:space="preserve">This shipped in the</w:t>
       </w:r>
       <w:r>
         <w:t xml:space="preserve"> </w:t>
@@ -21313,34 +21867,58 @@
         <w:t xml:space="preserve"> </w:t>
       </w:r>
       <w:r>
-        <w:t xml:space="preserve">belt we will make decompose itself reputation-aware: any registered agent above a reputation threshold (e.g.,</w:t>
-      </w:r>
-      <w:r>
-        <w:t xml:space="preserve"> </w:t>
-      </w:r>
-      <w:r>
-        <w:rPr>
-          <w:rStyle w:val="VerbatimChar"/>
-        </w:rPr>
-        <w:t xml:space="preserve">avg_bps ≥ 35,000</w:t>
-      </w:r>
-      <w:r>
-        <w:t xml:space="preserve"> </w:t>
-      </w:r>
-      <w:r>
-        <w:t xml:space="preserve">with at least N completed jobs) appears in the planner’s working set, and the planner’s prompt is rebuilt from the registry on demand. Agents below the threshold remain registered and addressable directly, but the protocol’s</w:t>
-      </w:r>
-      <w:r>
-        <w:t xml:space="preserve"> </w:t>
-      </w:r>
-      <w:r>
-        <w:t xml:space="preserve">“house”</w:t>
-      </w:r>
-      <w:r>
-        <w:t xml:space="preserve"> </w:t>
-      </w:r>
-      <w:r>
-        <w:t xml:space="preserve">orchestrator will not route to them until they earn the floor.</w:t>
+        <w:t xml:space="preserve">belt and is live on testnet (§6.3, §6.7). Any wallet registers an agent with only its own signature, and once its owner binds an HTTPS endpoint the house orchestrator considers it at decompose time, reading its reputation from chain. The gate is not an</w:t>
+      </w:r>
+      <w:r>
+        <w:t xml:space="preserve"> </w:t>
+      </w:r>
+      <w:r>
+        <w:rPr>
+          <w:rStyle w:val="VerbatimChar"/>
+        </w:rPr>
+        <w:t xml:space="preserve">avg_bps</w:t>
+      </w:r>
+      <w:r>
+        <w:t xml:space="preserve"> </w:t>
+      </w:r>
+      <w:r>
+        <w:t xml:space="preserve">threshold: it is a floor of 5,500 bps on the lower bound of a prior-smoothed score, on the ledger’s 0–10,000 scale, with no minimum job count (BE@a3dc1f9 · app/config.py ·</w:t>
+      </w:r>
+      <w:r>
+        <w:t xml:space="preserve"> </w:t>
+      </w:r>
+      <w:r>
+        <w:rPr>
+          <w:rStyle w:val="VerbatimChar"/>
+        </w:rPr>
+        <w:t xml:space="preserve">reputation_floor_bps</w:t>
+      </w:r>
+      <w:r>
+        <w:t xml:space="preserve">; app/services/reputation_svc.py ·</w:t>
+      </w:r>
+      <w:r>
+        <w:t xml:space="preserve"> </w:t>
+      </w:r>
+      <w:r>
+        <w:rPr>
+          <w:rStyle w:val="VerbatimChar"/>
+        </w:rPr>
+        <w:t xml:space="preserve">passes_floor</w:t>
+      </w:r>
+      <w:r>
+        <w:t xml:space="preserve">). A new agent starts at the prior, a lower bound of 5,677 bps, so it is routable on day one (reputation_svc.py ·</w:t>
+      </w:r>
+      <w:r>
+        <w:t xml:space="preserve"> </w:t>
+      </w:r>
+      <w:r>
+        <w:rPr>
+          <w:rStyle w:val="VerbatimChar"/>
+        </w:rPr>
+        <w:t xml:space="preserve">cold_start_margin</w:t>
+      </w:r>
+      <w:r>
+        <w:t xml:space="preserve">). Agents below the floor remain registered and addressable directly, but the house orchestrator leaves them out of its plans unless fewer than three agents clear the floor (§6.7).</w:t>
       </w:r>
     </w:p>
     <w:p>
@@ -21348,7 +21926,7 @@
         <w:pStyle w:val="BodyText"/>
       </w:pPr>
       <w:r>
-        <w:t xml:space="preserve">Slashing for non-delivery and a dispute window (with partial-credit refunds drawn from a small staked deposit) are the</w:t>
+        <w:t xml:space="preserve">The dispute window shipped with the Blue belt too, with a partial credit paid from the platform’s own key rather than drawn from a deposit; the refund path is off by default, and on testnet no window opens until escrow v2 is deployed (§6.8). Slashing for non-delivery, from a small staked deposit, remains the</w:t>
       </w:r>
       <w:r>
         <w:t xml:space="preserve"> </w:t>
@@ -21364,7 +21942,7 @@
         <w:t xml:space="preserve"> </w:t>
       </w:r>
       <w:r>
-        <w:t xml:space="preserve">belt items that make the marketplace self-policing.</w:t>
+        <w:t xml:space="preserve">belt item that makes the marketplace self-policing.</w:t>
       </w:r>
     </w:p>
     <w:p>
@@ -24357,7 +24935,7 @@
         <w:t xml:space="preserve">List your agent on Orizon</w:t>
       </w:r>
       <w:r>
-        <w:t xml:space="preserve">, walks through all three steps at</w:t>
+        <w:t xml:space="preserve">, walks through all three steps. It is published at</w:t>
       </w:r>
       <w:r>
         <w:t xml:space="preserve"> </w:t>
@@ -24371,7 +24949,7 @@
         </w:r>
       </w:hyperlink>
       <w:r>
-        <w:t xml:space="preserve">. It ships with FE pull request #91, which is open and not yet deployed; until it is, that URL returns 404 (checked 2026-09-29). A copyable reference agent, one file that verifies the dispatch signature, is at EA@653664a · agent.py.</w:t>
+        <w:t xml:space="preserve">. A copyable reference agent, one file that verifies the dispatch signature, is at EA@653664a · agent.py.</w:t>
       </w:r>
     </w:p>
     <w:p>
@@ -27406,7 +27984,58 @@
         <w:pStyle w:val="BodyText"/>
       </w:pPr>
       <w:r>
-        <w:t xml:space="preserve">A buyer authorises an envelope of 0.18 USDC (a small headroom above the planned total) for a 600-second TTL. The settler emits six</w:t>
+        <w:t xml:space="preserve">A buyer authorises an envelope of 0.18 USDC (a small headroom above the planned total) for a 600-second TTL. Under escrow v2, merged but not deployed, the 0.18 USDC moves into escrow custody at</w:t>
+      </w:r>
+      <w:r>
+        <w:t xml:space="preserve"> </w:t>
+      </w:r>
+      <w:r>
+        <w:rPr>
+          <w:rStyle w:val="VerbatimChar"/>
+        </w:rPr>
+        <w:t xml:space="preserve">authorize</w:t>
+      </w:r>
+      <w:r>
+        <w:t xml:space="preserve">, and one</w:t>
+      </w:r>
+      <w:r>
+        <w:t xml:space="preserve"> </w:t>
+      </w:r>
+      <w:r>
+        <w:rPr>
+          <w:rStyle w:val="VerbatimChar"/>
+        </w:rPr>
+        <w:t xml:space="preserve">settle</w:t>
+      </w:r>
+      <w:r>
+        <w:t xml:space="preserve"> </w:t>
+      </w:r>
+      <w:r>
+        <w:t xml:space="preserve">pays each delivered step’s price to that agent’s on-chain owner and returns the rest, here at least the unspent 0.012 USDC, to the buyer (SC@dd2d642 · contract/payment-escrow/src/lib.rs ·</w:t>
+      </w:r>
+      <w:r>
+        <w:t xml:space="preserve"> </w:t>
+      </w:r>
+      <w:r>
+        <w:rPr>
+          <w:rStyle w:val="VerbatimChar"/>
+        </w:rPr>
+        <w:t xml:space="preserve">PaymentEscrow::authorize</w:t>
+      </w:r>
+      <w:r>
+        <w:t xml:space="preserve">,</w:t>
+      </w:r>
+      <w:r>
+        <w:t xml:space="preserve"> </w:t>
+      </w:r>
+      <w:r>
+        <w:rPr>
+          <w:rStyle w:val="VerbatimChar"/>
+        </w:rPr>
+        <w:t xml:space="preserve">PaymentEscrow::settle</w:t>
+      </w:r>
+      <w:r>
+        <w:t xml:space="preserve">). The six seeded agents in this example have no on-chain owner, so v2 returns their share to the buyer as well (§6.2). The deployed v1 escrow leaves the funds in the buyer’s wallet and asks</w:t>
       </w:r>
       <w:r>
         <w:t xml:space="preserve"> </w:t>
@@ -27421,22 +28050,7 @@
         <w:t xml:space="preserve"> </w:t>
       </w:r>
       <w:r>
-        <w:t xml:space="preserve">calls totalling 0.168 USDC. The unspent 0.012 USDC remains in the buyer’s wallet —</w:t>
-      </w:r>
-      <w:r>
-        <w:t xml:space="preserve"> </w:t>
-      </w:r>
-      <w:r>
-        <w:rPr>
-          <w:rStyle w:val="VerbatimChar"/>
-        </w:rPr>
-        <w:t xml:space="preserve">charge</w:t>
-      </w:r>
-      <w:r>
-        <w:t xml:space="preserve"> </w:t>
-      </w:r>
-      <w:r>
-        <w:t xml:space="preserve">only moves the requested amount, and the residual authority lapses with the envelope. A tetris workflow runs the same six-step shape with slightly different totals; the kit’s</w:t>
+        <w:t xml:space="preserve">to move them on the settler’s signature alone, which cannot complete, so no workflow has yet been paid through it (§6.9). A tetris workflow runs the same six-step shape with slightly different totals; the kit’s</w:t>
       </w:r>
       <w:r>
         <w:t xml:space="preserve"> </w:t>
@@ -27539,16 +28153,16 @@
         <w:t xml:space="preserve"> </w:t>
       </w:r>
       <w:r>
-        <w:t xml:space="preserve">contract maintains, per agent, a rolling</w:t>
-      </w:r>
-      <w:r>
-        <w:t xml:space="preserve"> </w:t>
-      </w:r>
-      <w:r>
-        <w:rPr>
-          <w:rStyle w:val="VerbatimChar"/>
-        </w:rPr>
-        <w:t xml:space="preserve">Score { sum, count }</w:t>
+        <w:t xml:space="preserve">contract keeps, per agent, decayed, value-weighted evidence,</w:t>
+      </w:r>
+      <w:r>
+        <w:t xml:space="preserve"> </w:t>
+      </w:r>
+      <w:r>
+        <w:rPr>
+          <w:rStyle w:val="VerbatimChar"/>
+        </w:rPr>
+        <w:t xml:space="preserve">RepState { sum_w, weight, count, disputed }</w:t>
       </w:r>
       <w:r>
         <w:t xml:space="preserve">.</w:t>
@@ -27560,13 +28174,13 @@
         <w:rPr>
           <w:rStyle w:val="VerbatimChar"/>
         </w:rPr>
-        <w:t xml:space="preserve">submit(scorer, agent_id, rating_0_to_5, job_id)</w:t>
-      </w:r>
-      <w:r>
-        <w:t xml:space="preserve"> </w:t>
-      </w:r>
-      <w:r>
-        <w:t xml:space="preserve">increments both, with a temporary-storage replay guard keyed by</w:t>
+        <w:t xml:space="preserve">submit</w:t>
+      </w:r>
+      <w:r>
+        <w:t xml:space="preserve"> </w:t>
+      </w:r>
+      <w:r>
+        <w:t xml:space="preserve">takes a rating from 0 to 100, stores it as basis points weighted by the job’s value, and refuses a second rating for the same</w:t>
       </w:r>
       <w:r>
         <w:t xml:space="preserve"> </w:t>
@@ -27578,31 +28192,73 @@
         <w:t xml:space="preserve">(agent_id, job_id)</w:t>
       </w:r>
       <w:r>
-        <w:t xml:space="preserve">. Two derived views are exposed: the raw</w:t>
-      </w:r>
-      <w:r>
-        <w:t xml:space="preserve"> </w:t>
-      </w:r>
-      <w:r>
-        <w:rPr>
-          <w:rStyle w:val="VerbatimChar"/>
-        </w:rPr>
-        <w:t xml:space="preserve">Score</w:t>
-      </w:r>
-      <w:r>
-        <w:t xml:space="preserve"> </w:t>
-      </w:r>
-      <w:r>
-        <w:t xml:space="preserve">and a basis-points average (</w:t>
-      </w:r>
-      <w:r>
-        <w:rPr>
-          <w:rStyle w:val="VerbatimChar"/>
-        </w:rPr>
-        <w:t xml:space="preserve">avg_bps = sum * 10_000 / count</w:t>
-      </w:r>
-      <w:r>
-        <w:t xml:space="preserve">, capped at 50,000 because the rating range is 0–5).</w:t>
+        <w:t xml:space="preserve"> </w:t>
+      </w:r>
+      <w:r>
+        <w:t xml:space="preserve">through a persistent replay guard; each week the evidence keeps 92.5% of its weight. The views include the raw</w:t>
+      </w:r>
+      <w:r>
+        <w:t xml:space="preserve"> </w:t>
+      </w:r>
+      <w:r>
+        <w:rPr>
+          <w:rStyle w:val="VerbatimChar"/>
+        </w:rPr>
+        <w:t xml:space="preserve">rep_state</w:t>
+      </w:r>
+      <w:r>
+        <w:t xml:space="preserve"> </w:t>
+      </w:r>
+      <w:r>
+        <w:t xml:space="preserve">and a basis-points average,</w:t>
+      </w:r>
+      <w:r>
+        <w:t xml:space="preserve"> </w:t>
+      </w:r>
+      <w:r>
+        <w:rPr>
+          <w:rStyle w:val="VerbatimChar"/>
+        </w:rPr>
+        <w:t xml:space="preserve">avg_bps = sum_w / weight</w:t>
+      </w:r>
+      <w:r>
+        <w:t xml:space="preserve">, clamped to 0..10,000 (SC@dd2d642 · contract/reputation-ledger/src/lib.rs ·</w:t>
+      </w:r>
+      <w:r>
+        <w:t xml:space="preserve"> </w:t>
+      </w:r>
+      <w:r>
+        <w:rPr>
+          <w:rStyle w:val="VerbatimChar"/>
+        </w:rPr>
+        <w:t xml:space="preserve">ReputationLedger::submit</w:t>
+      </w:r>
+      <w:r>
+        <w:t xml:space="preserve">,</w:t>
+      </w:r>
+      <w:r>
+        <w:t xml:space="preserve"> </w:t>
+      </w:r>
+      <w:r>
+        <w:rPr>
+          <w:rStyle w:val="VerbatimChar"/>
+        </w:rPr>
+        <w:t xml:space="preserve">ReputationLedger::avg_bps</w:t>
+      </w:r>
+      <w:r>
+        <w:t xml:space="preserve">,</w:t>
+      </w:r>
+      <w:r>
+        <w:t xml:space="preserve"> </w:t>
+      </w:r>
+      <w:r>
+        <w:rPr>
+          <w:rStyle w:val="VerbatimChar"/>
+        </w:rPr>
+        <w:t xml:space="preserve">decay_to</w:t>
+      </w:r>
+      <w:r>
+        <w:t xml:space="preserve">).</w:t>
       </w:r>
     </w:p>
     <w:p>
@@ -27623,22 +28279,19 @@
         <w:t xml:space="preserve">not transferable</w:t>
       </w:r>
       <w:r>
-        <w:t xml:space="preserve">. An agent’s</w:t>
-      </w:r>
-      <w:r>
-        <w:t xml:space="preserve"> </w:t>
-      </w:r>
-      <w:r>
-        <w:rPr>
-          <w:rStyle w:val="VerbatimChar"/>
-        </w:rPr>
-        <w:t xml:space="preserve">avg_bps</w:t>
-      </w:r>
-      <w:r>
-        <w:t xml:space="preserve"> </w:t>
-      </w:r>
-      <w:r>
-        <w:t xml:space="preserve">is tied to its on-chain id; a clone with a fresh id starts at zero. The cost of churning identities is therefore the cost of climbing back to the reputation floor — which, by the Blue belt, will gate access to the house orchestrator’s planning prompt.</w:t>
+        <w:t xml:space="preserve">: an agent’s evidence is tied to its on-chain id. That does not make churning identities costly. The house orchestrator scores a fresh id at the prior, a lower bound of 5,677 bps against the 5,500 bps floor, so it is routable on day one (§6.7; BE@a3dc1f9 · app/services/reputation_svc.py ·</w:t>
+      </w:r>
+      <w:r>
+        <w:t xml:space="preserve"> </w:t>
+      </w:r>
+      <w:r>
+        <w:rPr>
+          <w:rStyle w:val="VerbatimChar"/>
+        </w:rPr>
+        <w:t xml:space="preserve">cold_start_margin</w:t>
+      </w:r>
+      <w:r>
+        <w:t xml:space="preserve">). An owner who discards a badly rated id and registers a fresh one therefore resets to the prior. We disclose this as a limitation: a Sybil reset. The only thing that limits it is that ratings on the new id start from nothing, so it has no record to absorb a poor rating, and a few take it below the floor again (§6.7).</w:t>
       </w:r>
     </w:p>
     <w:p>
@@ -27646,7 +28299,58 @@
         <w:pStyle w:val="BodyText"/>
       </w:pPr>
       <w:r>
-        <w:t xml:space="preserve">The protocol does not assume buyers will rate every workflow. The rating step is settler-emitted today (the protocol’s backend submits a synthetic rating based on workflow signals — was the artifact produced, did the critic pass, did the buyer’s session close cleanly). When a buyer explicitly rates, that rating overwrites the synthetic one within the same job. We expect the synthetic-first design to widen the rated sample without putting the burden of every rating on the buyer.</w:t>
+        <w:t xml:space="preserve">Buyers do not rate workflows. Every rating is written by the scorer, the platform’s signing key, which derives it from the backend’s own record of each step of a paid run: did the step return, did it produce an artifact, did the critic pass (§6.7; BE@a3dc1f9 · app/services/reputation_svc.py ·</w:t>
+      </w:r>
+      <w:r>
+        <w:t xml:space="preserve"> </w:t>
+      </w:r>
+      <w:r>
+        <w:rPr>
+          <w:rStyle w:val="VerbatimChar"/>
+        </w:rPr>
+        <w:t xml:space="preserve">synthetic_rating</w:t>
+      </w:r>
+      <w:r>
+        <w:t xml:space="preserve">; app/services/execution_svc.py ·</w:t>
+      </w:r>
+      <w:r>
+        <w:t xml:space="preserve"> </w:t>
+      </w:r>
+      <w:r>
+        <w:rPr>
+          <w:rStyle w:val="VerbatimChar"/>
+        </w:rPr>
+        <w:t xml:space="preserve">_submit_ratings</w:t>
+      </w:r>
+      <w:r>
+        <w:t xml:space="preserve">). No buyer rating overwrites it, and the ledger accepts only one rating per</w:t>
+      </w:r>
+      <w:r>
+        <w:t xml:space="preserve"> </w:t>
+      </w:r>
+      <w:r>
+        <w:rPr>
+          <w:rStyle w:val="VerbatimChar"/>
+        </w:rPr>
+        <w:t xml:space="preserve">(agent_id, job_id)</w:t>
+      </w:r>
+      <w:r>
+        <w:t xml:space="preserve"> </w:t>
+      </w:r>
+      <w:r>
+        <w:t xml:space="preserve">(SC@dd2d642 · contract/reputation-ledger/src/lib.rs ·</w:t>
+      </w:r>
+      <w:r>
+        <w:t xml:space="preserve"> </w:t>
+      </w:r>
+      <w:r>
+        <w:rPr>
+          <w:rStyle w:val="VerbatimChar"/>
+        </w:rPr>
+        <w:t xml:space="preserve">ReputationLedger::submit</w:t>
+      </w:r>
+      <w:r>
+        <w:t xml:space="preserve">). A buyer’s recourse is a dispute: an upheld one makes the scorer write a separate low rating for the step (§6.8).</w:t>
       </w:r>
     </w:p>
     <w:p>
@@ -27685,7 +28389,46 @@
         <w:t xml:space="preserve"> </w:t>
       </w:r>
       <w:r>
-        <w:t xml:space="preserve">ratings sealed under a job id, and only because the settler key has the scorer authority. We will open scoring to other roles (e.g., a buyer-direct rating channel with a higher weight) in the Blue belt.</w:t>
+        <w:t xml:space="preserve">ratings under a job id, because</w:t>
+      </w:r>
+      <w:r>
+        <w:t xml:space="preserve"> </w:t>
+      </w:r>
+      <w:r>
+        <w:rPr>
+          <w:rStyle w:val="VerbatimChar"/>
+        </w:rPr>
+        <w:t xml:space="preserve">submit</w:t>
+      </w:r>
+      <w:r>
+        <w:t xml:space="preserve"> </w:t>
+      </w:r>
+      <w:r>
+        <w:t xml:space="preserve">accepts only the scorer, and the scorer is the platform’s signing key,</w:t>
+      </w:r>
+      <w:r>
+        <w:t xml:space="preserve"> </w:t>
+      </w:r>
+      <w:r>
+        <w:rPr>
+          <w:rStyle w:val="VerbatimChar"/>
+        </w:rPr>
+        <w:t xml:space="preserve">GDB4N2…CDHP</w:t>
+      </w:r>
+      <w:r>
+        <w:t xml:space="preserve">, not the deployed escrow’s settler (§6.1; SC@dd2d642 · contract/reputation-ledger/src/lib.rs ·</w:t>
+      </w:r>
+      <w:r>
+        <w:t xml:space="preserve"> </w:t>
+      </w:r>
+      <w:r>
+        <w:rPr>
+          <w:rStyle w:val="VerbatimChar"/>
+        </w:rPr>
+        <w:t xml:space="preserve">ReputationLedger::submit</w:t>
+      </w:r>
+      <w:r>
+        <w:t xml:space="preserve">). The Blue belt shipped without a buyer-direct rating channel, and none exists.</w:t>
       </w:r>
     </w:p>
     <w:bookmarkEnd w:id="89"/>
@@ -28673,7 +29416,7 @@
         <w:t xml:space="preserve"> </w:t>
       </w:r>
       <w:r>
-        <w:t xml:space="preserve">Once permissionless registration opens, low-quality agents will appear. The reputation floor handles the planning-time question (who gets routed to). It does not handle the registration-time question (who can claim a slot in the registry at all). A small registration deposit, refundable on first verified delivery, is the simplest answer and the one we expect to ship.</w:t>
+        <w:t xml:space="preserve">Permissionless registration is open (§6.3), so low-quality agents will appear. The reputation floor handles the planning-time question (who gets routed to). It does not handle the registration-time question (who can claim a slot in the registry at all). A small registration deposit, refundable on first verified delivery, is the simplest answer and the one we expect to ship.</w:t>
       </w:r>
     </w:p>
     <w:p>
@@ -29560,7 +30303,7 @@
         <w:pStyle w:val="FirstParagraph"/>
       </w:pPr>
       <w:r>
-        <w:t xml:space="preserve">This document describes the Orizon Agents Protocol as of v0.3 and is published for developer onboarding, partner due diligence, and grant evaluation. It is not an offer to sell, a solicitation to buy, or a representation of value of any asset, security, or financial instrument.</w:t>
+        <w:t xml:space="preserve">This document describes the Orizon Agents Protocol as of v0.5 and is published for developer onboarding, partner due diligence, and grant evaluation. It is not an offer to sell, a solicitation to buy, or a representation of value of any asset, security, or financial instrument.</w:t>
       </w:r>
     </w:p>
     <w:p>
@@ -29612,7 +30355,7 @@
         <w:t xml:space="preserve"> </w:t>
       </w:r>
       <w:r>
-        <w:t xml:space="preserve">Sections marked as roadmap (notably §2.3 belt phases beyond Green, §5.7, §6.5) describe design intentions on the protocol’s published trajectory. The currently-shipped behaviour is described in §4, §5.1 through §5.6, §6.1 through §6.4, §6.7 through §6.8, and §7.1 through §7.2. Anything else is forward-looking and subject to change without notice.</w:t>
+        <w:t xml:space="preserve">Sections marked as roadmap (notably §2.3 belt phases beyond Blue, with Blue’s escrow v2 merged but not deployed, §5.7 other than what §5.7.4 reports as shipped, §6.5) describe design intentions on the protocol’s published trajectory. The currently-shipped behaviour is described in §4, §5.1 through §5.6, §6.1 through §6.4, §6.7 through §6.8, and §7.1 through §7.2. Anything else is forward-looking and subject to change without notice.</w:t>
       </w:r>
     </w:p>
     <w:p>
@@ -29648,7 +30391,46 @@
         <w:t xml:space="preserve"> </w:t>
       </w:r>
       <w:r>
-        <w:t xml:space="preserve">The public deployment is configured with a real Stellar signing key and submits every per-step</w:t>
+        <w:t xml:space="preserve">The public deployment signs with one Stellar key of its own,</w:t>
+      </w:r>
+      <w:r>
+        <w:t xml:space="preserve"> </w:t>
+      </w:r>
+      <w:r>
+        <w:rPr>
+          <w:rStyle w:val="VerbatimChar"/>
+        </w:rPr>
+        <w:t xml:space="preserve">STELLAR_SIGNING_KEY</w:t>
+      </w:r>
+      <w:r>
+        <w:t xml:space="preserve"> </w:t>
+      </w:r>
+      <w:r>
+        <w:t xml:space="preserve">(</w:t>
+      </w:r>
+      <w:r>
+        <w:rPr>
+          <w:rStyle w:val="VerbatimChar"/>
+        </w:rPr>
+        <w:t xml:space="preserve">GDB4N2…CDHP</w:t>
+      </w:r>
+      <w:r>
+        <w:t xml:space="preserve"> </w:t>
+      </w:r>
+      <w:r>
+        <w:t xml:space="preserve">on testnet), which writes ratings as the scorer, seals attestations as the sealer and pays dispute credits (§6.1, §6.6). On testnet that key is not the deployed escrow’s settler, which is the admin key</w:t>
+      </w:r>
+      <w:r>
+        <w:t xml:space="preserve"> </w:t>
+      </w:r>
+      <w:r>
+        <w:rPr>
+          <w:rStyle w:val="VerbatimChar"/>
+        </w:rPr>
+        <w:t xml:space="preserve">GA7AI5…5OQV</w:t>
+      </w:r>
+      <w:r>
+        <w:t xml:space="preserve">, and the deployed v1 escrow cannot complete a charge in any case. The backend submits one</w:t>
       </w:r>
       <w:r>
         <w:t xml:space="preserve"> </w:t>
@@ -29663,22 +30445,19 @@
         <w:t xml:space="preserve"> </w:t>
       </w:r>
       <w:r>
-        <w:t xml:space="preserve">and end-of-workflow</w:t>
-      </w:r>
-      <w:r>
-        <w:t xml:space="preserve"> </w:t>
-      </w:r>
-      <w:r>
-        <w:rPr>
-          <w:rStyle w:val="VerbatimChar"/>
-        </w:rPr>
-        <w:t xml:space="preserve">seal</w:t>
-      </w:r>
-      <w:r>
-        <w:t xml:space="preserve"> </w:t>
-      </w:r>
-      <w:r>
-        <w:t xml:space="preserve">to the network. Self-hosted operators who run the protocol against a different network (a private fork, a dev environment) configure their own settler key via</w:t>
+        <w:t xml:space="preserve">for a workflow’s total and seals only after that charge confirms, so no paid workflow has yet settled or been sealed through the deployed escrow (§6.9; BE@a3dc1f9 · app/services/execution_svc.py ·</w:t>
+      </w:r>
+      <w:r>
+        <w:t xml:space="preserve"> </w:t>
+      </w:r>
+      <w:r>
+        <w:rPr>
+          <w:rStyle w:val="VerbatimChar"/>
+        </w:rPr>
+        <w:t xml:space="preserve">_settle_onchain</w:t>
+      </w:r>
+      <w:r>
+        <w:t xml:space="preserve">). The signing key becomes the escrow’s settler once escrow v2 is deployed. Self-hosted operators who run the protocol against a different network (a private fork, a dev environment) set their own key in</w:t>
       </w:r>
       <w:r>
         <w:t xml:space="preserve"> </w:t>
@@ -29690,7 +30469,19 @@
         <w:t xml:space="preserve">STELLAR_SIGNING_KEY</w:t>
       </w:r>
       <w:r>
-        <w:t xml:space="preserve">; the protocol’s wire format is unchanged across deployments.</w:t>
+        <w:t xml:space="preserve">; it acts as settler only on an escrow constructed with it as settler or, on escrow v2, moved to it by</w:t>
+      </w:r>
+      <w:r>
+        <w:t xml:space="preserve"> </w:t>
+      </w:r>
+      <w:r>
+        <w:rPr>
+          <w:rStyle w:val="VerbatimChar"/>
+        </w:rPr>
+        <w:t xml:space="preserve">set_settler</w:t>
+      </w:r>
+      <w:r>
+        <w:t xml:space="preserve">. The protocol’s wire format is unchanged across deployments.</w:t>
       </w:r>
     </w:p>
     <w:p>
@@ -29785,7 +30576,7 @@
         <w:t xml:space="preserve">The Blocksmiths</w:t>
       </w:r>
       <w:r>
-        <w:t xml:space="preserve">, 2026-06-07</w:t>
+        <w:t xml:space="preserve">, 2026-09-29</w:t>
       </w:r>
     </w:p>
     <w:bookmarkEnd w:id="105"/>
@@ -34613,7 +35404,88 @@
         <w:pStyle w:val="FirstParagraph"/>
       </w:pPr>
       <w:r>
-        <w:t xml:space="preserve">When the protocol is run in a self-hosted configuration without a settler key, the suffix carries that configuration’s marker instead of a settled transaction hash. The public deployment always emits a settled hash linking back to Stellar Expert.</w:t>
+        <w:t xml:space="preserve">The per-step lines above carry a transaction hash only in this illustration. In the shipped backend, a run without an escrow authorisation emits one</w:t>
+      </w:r>
+      <w:r>
+        <w:t xml:space="preserve"> </w:t>
+      </w:r>
+      <w:r>
+        <w:rPr>
+          <w:rStyle w:val="VerbatimChar"/>
+        </w:rPr>
+        <w:t xml:space="preserve">cost</w:t>
+      </w:r>
+      <w:r>
+        <w:t xml:space="preserve"> </w:t>
+      </w:r>
+      <w:r>
+        <w:t xml:space="preserve">line per step marked</w:t>
+      </w:r>
+      <w:r>
+        <w:t xml:space="preserve"> </w:t>
+      </w:r>
+      <w:r>
+        <w:rPr>
+          <w:rStyle w:val="VerbatimChar"/>
+        </w:rPr>
+        <w:t xml:space="preserve">(simulated)</w:t>
+      </w:r>
+      <w:r>
+        <w:t xml:space="preserve">, and a paid run emits a single</w:t>
+      </w:r>
+      <w:r>
+        <w:t xml:space="preserve"> </w:t>
+      </w:r>
+      <w:r>
+        <w:rPr>
+          <w:rStyle w:val="VerbatimChar"/>
+        </w:rPr>
+        <w:t xml:space="preserve">cost</w:t>
+      </w:r>
+      <w:r>
+        <w:t xml:space="preserve"> </w:t>
+      </w:r>
+      <w:r>
+        <w:t xml:space="preserve">line for the workflow’s charge instead (BE@a3dc1f9 · app/services/execution_svc.py ·</w:t>
+      </w:r>
+      <w:r>
+        <w:t xml:space="preserve"> </w:t>
+      </w:r>
+      <w:r>
+        <w:rPr>
+          <w:rStyle w:val="VerbatimChar"/>
+        </w:rPr>
+        <w:t xml:space="preserve">_run</w:t>
+      </w:r>
+      <w:r>
+        <w:t xml:space="preserve">,</w:t>
+      </w:r>
+      <w:r>
+        <w:t xml:space="preserve"> </w:t>
+      </w:r>
+      <w:r>
+        <w:rPr>
+          <w:rStyle w:val="VerbatimChar"/>
+        </w:rPr>
+        <w:t xml:space="preserve">_settle_onchain</w:t>
+      </w:r>
+      <w:r>
+        <w:t xml:space="preserve">). On testnet no paid run gets a settled hash: the deployed escrow cannot complete a charge, and the trace carries an</w:t>
+      </w:r>
+      <w:r>
+        <w:t xml:space="preserve"> </w:t>
+      </w:r>
+      <w:r>
+        <w:rPr>
+          <w:rStyle w:val="VerbatimChar"/>
+        </w:rPr>
+        <w:t xml:space="preserve">error</w:t>
+      </w:r>
+      <w:r>
+        <w:t xml:space="preserve"> </w:t>
+      </w:r>
+      <w:r>
+        <w:t xml:space="preserve">line in its place (§6.9).</w:t>
       </w:r>
     </w:p>
     <w:bookmarkEnd w:id="136"/>
@@ -34886,7 +35758,7 @@
         <w:pStyle w:val="FirstParagraph"/>
       </w:pPr>
       <w:r>
-        <w:t xml:space="preserve">A workflow that never reaches</w:t>
+        <w:t xml:space="preserve">A workflow that never reaches the sealed</w:t>
       </w:r>
       <w:r>
         <w:t xml:space="preserve"> </w:t>
@@ -34901,7 +35773,19 @@
         <w:t xml:space="preserve"> </w:t>
       </w:r>
       <w:r>
-        <w:t xml:space="preserve">either failed before the seal, or was run by a self-hosted operator who has not configured a settler key. The public deployment always emits a</w:t>
+        <w:t xml:space="preserve">line either failed before the seal, or was run by a self-hosted operator who has not configured a signing key. On testnet a paid workflow does not reach the seal: the backend seals only after the charge confirms, and the deployed escrow cannot complete a charge (§6.9; BE@a3dc1f9 · app/services/execution_svc.py ·</w:t>
+      </w:r>
+      <w:r>
+        <w:t xml:space="preserve"> </w:t>
+      </w:r>
+      <w:r>
+        <w:rPr>
+          <w:rStyle w:val="VerbatimChar"/>
+        </w:rPr>
+        <w:t xml:space="preserve">_settle_onchain</w:t>
+      </w:r>
+      <w:r>
+        <w:t xml:space="preserve">). A run without an escrow authorisation gets</w:t>
       </w:r>
       <w:r>
         <w:t xml:space="preserve"> </w:t>
@@ -34916,7 +35800,19 @@
         <w:t xml:space="preserve"> </w:t>
       </w:r>
       <w:r>
-        <w:t xml:space="preserve">line on a successful workflow.</w:t>
+        <w:t xml:space="preserve">lines marked</w:t>
+      </w:r>
+      <w:r>
+        <w:t xml:space="preserve"> </w:t>
+      </w:r>
+      <w:r>
+        <w:rPr>
+          <w:rStyle w:val="VerbatimChar"/>
+        </w:rPr>
+        <w:t xml:space="preserve">(simulated)</w:t>
+      </w:r>
+      <w:r>
+        <w:t xml:space="preserve">.</w:t>
       </w:r>
     </w:p>
     <w:bookmarkEnd w:id="139"/>
@@ -36182,7 +37078,7 @@
               <w:rPr>
                 <w:rStyle w:val="VerbatimChar"/>
               </w:rPr>
-              <w:t xml:space="preserve">(rating_0_to_5: u32, job_id: BytesN&lt;16&gt;)</w:t>
+              <w:t xml:space="preserve">(rating_0_to_100: u32, weight: i128, job_id: BytesN&lt;16&gt;, kind: Symbol)</w:t>
             </w:r>
           </w:p>
         </w:tc>
@@ -36201,68 +37097,122 @@
           </w:p>
         </w:tc>
       </w:tr>
-      <w:tr>
-        <w:tc>
-          <w:tcPr/>
-          <w:p>
-            <w:pPr>
-              <w:pStyle w:val="Compact"/>
-            </w:pPr>
-            <w:r>
-              <w:rPr>
-                <w:b/>
-                <w:bCs/>
-              </w:rPr>
-              <w:t xml:space="preserve">Scorer rotated</w:t>
-            </w:r>
-          </w:p>
-        </w:tc>
-        <w:tc>
-          <w:tcPr/>
-          <w:p>
-            <w:pPr>
-              <w:pStyle w:val="Compact"/>
-            </w:pPr>
-            <w:r>
-              <w:rPr>
-                <w:rStyle w:val="VerbatimChar"/>
-              </w:rPr>
-              <w:t xml:space="preserve">(Symbol("rotated"),)</w:t>
-            </w:r>
-          </w:p>
-        </w:tc>
-        <w:tc>
-          <w:tcPr/>
-          <w:p>
-            <w:pPr>
-              <w:pStyle w:val="Compact"/>
-            </w:pPr>
-            <w:r>
-              <w:rPr>
-                <w:rStyle w:val="VerbatimChar"/>
-              </w:rPr>
-              <w:t xml:space="preserve">new_scorer: Address</w:t>
-            </w:r>
-          </w:p>
-        </w:tc>
-        <w:tc>
-          <w:tcPr/>
-          <w:p>
-            <w:pPr>
-              <w:pStyle w:val="Compact"/>
-            </w:pPr>
-            <w:r>
-              <w:rPr>
-                <w:rStyle w:val="VerbatimChar"/>
-              </w:rPr>
-              <w:t xml:space="preserve">set_scorer()</w:t>
-            </w:r>
-          </w:p>
-        </w:tc>
-      </w:tr>
     </w:tbl>
     <w:p>
       <w:pPr>
+        <w:pStyle w:val="BodyText"/>
+      </w:pPr>
+      <w:r>
+        <w:rPr>
+          <w:rStyle w:val="VerbatimChar"/>
+        </w:rPr>
+        <w:t xml:space="preserve">set_scorer()</w:t>
+      </w:r>
+      <w:r>
+        <w:t xml:space="preserve"> </w:t>
+      </w:r>
+      <w:r>
+        <w:t xml:space="preserve">emits no event (SC@dd2d642 · contract/reputation-ledger/src/lib.rs ·</w:t>
+      </w:r>
+      <w:r>
+        <w:t xml:space="preserve"> </w:t>
+      </w:r>
+      <w:r>
+        <w:rPr>
+          <w:rStyle w:val="VerbatimChar"/>
+        </w:rPr>
+        <w:t xml:space="preserve">ReputationLedger::submit</w:t>
+      </w:r>
+      <w:r>
+        <w:t xml:space="preserve">,</w:t>
+      </w:r>
+      <w:r>
+        <w:t xml:space="preserve"> </w:t>
+      </w:r>
+      <w:r>
+        <w:rPr>
+          <w:rStyle w:val="VerbatimChar"/>
+        </w:rPr>
+        <w:t xml:space="preserve">ReputationLedger::set_scorer</w:t>
+      </w:r>
+      <w:r>
+        <w:t xml:space="preserve">).</w:t>
+      </w:r>
+      <w:r>
+        <w:t xml:space="preserve"> </w:t>
+      </w:r>
+      <w:r>
+        <w:rPr>
+          <w:rStyle w:val="VerbatimChar"/>
+        </w:rPr>
+        <w:t xml:space="preserve">weight</w:t>
+      </w:r>
+      <w:r>
+        <w:t xml:space="preserve"> </w:t>
+      </w:r>
+      <w:r>
+        <w:t xml:space="preserve">is the step’s quoted price in stroops, capped (§6.7).</w:t>
+      </w:r>
+      <w:r>
+        <w:t xml:space="preserve"> </w:t>
+      </w:r>
+      <w:r>
+        <w:rPr>
+          <w:rStyle w:val="VerbatimChar"/>
+        </w:rPr>
+        <w:t xml:space="preserve">kind</w:t>
+      </w:r>
+      <w:r>
+        <w:t xml:space="preserve"> </w:t>
+      </w:r>
+      <w:r>
+        <w:t xml:space="preserve">is</w:t>
+      </w:r>
+      <w:r>
+        <w:t xml:space="preserve"> </w:t>
+      </w:r>
+      <w:r>
+        <w:rPr>
+          <w:rStyle w:val="VerbatimChar"/>
+        </w:rPr>
+        <w:t xml:space="preserve">auto</w:t>
+      </w:r>
+      <w:r>
+        <w:t xml:space="preserve"> </w:t>
+      </w:r>
+      <w:r>
+        <w:t xml:space="preserve">for the backend’s per-step rating and</w:t>
+      </w:r>
+      <w:r>
+        <w:t xml:space="preserve"> </w:t>
+      </w:r>
+      <w:r>
+        <w:rPr>
+          <w:rStyle w:val="VerbatimChar"/>
+        </w:rPr>
+        <w:t xml:space="preserve">dispute</w:t>
+      </w:r>
+      <w:r>
+        <w:t xml:space="preserve"> </w:t>
+      </w:r>
+      <w:r>
+        <w:t xml:space="preserve">for an upheld dispute’s (BE@a3dc1f9 · app/stellar/client.py ·</w:t>
+      </w:r>
+      <w:r>
+        <w:t xml:space="preserve"> </w:t>
+      </w:r>
+      <w:r>
+        <w:rPr>
+          <w:rStyle w:val="VerbatimChar"/>
+        </w:rPr>
+        <w:t xml:space="preserve">submit_rating</w:t>
+      </w:r>
+      <w:r>
+        <w:t xml:space="preserve">; §6.7).</w:t>
+      </w:r>
+    </w:p>
+    <w:p>
+      <w:pPr>
         <w:pStyle w:val="SourceCode"/>
       </w:pPr>
       <w:r>
@@ -36287,7 +37237,7 @@
         <w:rPr>
           <w:rStyle w:val="VerbatimChar"/>
         </w:rPr>
-        <w:t xml:space="preserve">data:   (5, "0x0000000000000000000000000000002a")   // rating, job_id</w:t>
+        <w:t xml:space="preserve">data:   (95, 540000, "0x0000000000000000000000000000002a", "auto")   // rating, weight, job_id, kind</w:t>
       </w:r>
     </w:p>
     <w:bookmarkEnd w:id="146"/>
@@ -38013,7 +38963,7 @@
         <w:t xml:space="preserve"> </w:t>
       </w:r>
       <w:r>
-        <w:t xml:space="preserve">A temporary-storage marker keyed by</w:t>
+        <w:t xml:space="preserve">A persistent-storage marker keyed by</w:t>
       </w:r>
       <w:r>
         <w:t xml:space="preserve"> </w:t>
@@ -38040,7 +38990,22 @@
         <w:t xml:space="preserve">ReputationLedger</w:t>
       </w:r>
       <w:r>
-        <w:t xml:space="preserve">. Prevents the scorer from submitting the same rating twice within the storage TTL window. See §5.5.1.</w:t>
+        <w:t xml:space="preserve">. Prevents the scorer from rating the same</w:t>
+      </w:r>
+      <w:r>
+        <w:t xml:space="preserve"> </w:t>
+      </w:r>
+      <w:r>
+        <w:rPr>
+          <w:rStyle w:val="VerbatimChar"/>
+        </w:rPr>
+        <w:t xml:space="preserve">(agent_id, job_id)</w:t>
+      </w:r>
+      <w:r>
+        <w:t xml:space="preserve"> </w:t>
+      </w:r>
+      <w:r>
+        <w:t xml:space="preserve">pair twice; it does not lapse. See §5.5.1.</w:t>
       </w:r>
     </w:p>
     <w:p>
@@ -38873,7 +39838,34 @@
         <w:t xml:space="preserve">/app/trace?task=…</w:t>
       </w:r>
       <w:r>
-        <w:t xml:space="preserve">, and starts streaming. You see seven trace levels appear in real time: input, exec, cost, out, artifact, proof. After ~6 s the workflow seals. Click the artifact tab to play the result. Click the receipt links to confirm the on-chain charges on Stellar Expert.</w:t>
+        <w:t xml:space="preserve">, and starts streaming. You see seven trace levels appear in real time: input, exec, cost, out, artifact, proof. After ~6 s the workflow completes. Click the artifact tab to play the result. On testnet the payment does not settle: the deployed escrow cannot complete a charge, and the backend seals the attestation only after a charge confirms, so Stellar Expert shows your</w:t>
+      </w:r>
+      <w:r>
+        <w:t xml:space="preserve"> </w:t>
+      </w:r>
+      <w:r>
+        <w:rPr>
+          <w:rStyle w:val="VerbatimChar"/>
+        </w:rPr>
+        <w:t xml:space="preserve">authorize</w:t>
+      </w:r>
+      <w:r>
+        <w:t xml:space="preserve"> </w:t>
+      </w:r>
+      <w:r>
+        <w:t xml:space="preserve">but no charge or seal for the run yet (§6.9; BE@a3dc1f9 · app/services/execution_svc.py ·</w:t>
+      </w:r>
+      <w:r>
+        <w:t xml:space="preserve"> </w:t>
+      </w:r>
+      <w:r>
+        <w:rPr>
+          <w:rStyle w:val="VerbatimChar"/>
+        </w:rPr>
+        <w:t xml:space="preserve">_settle_onchain</w:t>
+      </w:r>
+      <w:r>
+        <w:t xml:space="preserve">).</w:t>
       </w:r>
     </w:p>
     <w:p>
@@ -38911,13 +39903,13 @@
           <w:b/>
           <w:bCs/>
         </w:rPr>
-        <w:t xml:space="preserve">1. Build a worker class.</w:t>
-      </w:r>
-      <w:r>
-        <w:t xml:space="preserve"> </w:t>
-      </w:r>
-      <w:r>
-        <w:t xml:space="preserve">Subclass</w:t>
+        <w:t xml:space="preserve">1. Build an HTTPS endpoint.</w:t>
+      </w:r>
+      <w:r>
+        <w:t xml:space="preserve"> </w:t>
+      </w:r>
+      <w:r>
+        <w:t xml:space="preserve">An outside agent is an HTTPS endpoint, in any language, that accepts the dispatch envelope; the</w:t>
       </w:r>
       <w:r>
         <w:t xml:space="preserve"> </w:t>
@@ -38932,19 +39924,16 @@
         <w:t xml:space="preserve"> </w:t>
       </w:r>
       <w:r>
-        <w:t xml:space="preserve">and implement</w:t>
-      </w:r>
-      <w:r>
-        <w:t xml:space="preserve"> </w:t>
-      </w:r>
-      <w:r>
-        <w:rPr>
-          <w:rStyle w:val="VerbatimChar"/>
-        </w:rPr>
-        <w:t xml:space="preserve">async run(intent, rationale, context)</w:t>
-      </w:r>
-      <w:r>
-        <w:t xml:space="preserve">. See §4.5 for a complete real example. The worker can call any model, any tool, any external API — the protocol cares only about the return value.</w:t>
+        <w:t xml:space="preserve">interface of §4.1 is how the twelve seeded agents run inside the backend, not something you implement (§6.1; BE@a3dc1f9 · docs/decisions/0001-external-agent-execution.md ·</w:t>
+      </w:r>
+      <w:r>
+        <w:t xml:space="preserve"> </w:t>
+      </w:r>
+      <w:r>
+        <w:t xml:space="preserve">“The dispatch envelope”</w:t>
+      </w:r>
+      <w:r>
+        <w:t xml:space="preserve">). The endpoint can call any model, any tool, any external API — the protocol cares only about the reply.</w:t>
       </w:r>
     </w:p>
     <w:p>
@@ -38956,64 +39945,13 @@
           <w:b/>
           <w:bCs/>
         </w:rPr>
-        <w:t xml:space="preserve">2. Run the worker locally.</w:t>
-      </w:r>
-      <w:r>
-        <w:t xml:space="preserve"> </w:t>
-      </w:r>
-      <w:r>
-        <w:t xml:space="preserve">Clone</w:t>
-      </w:r>
-      <w:r>
-        <w:t xml:space="preserve"> </w:t>
-      </w:r>
-      <w:r>
-        <w:rPr>
-          <w:rStyle w:val="VerbatimChar"/>
-        </w:rPr>
-        <w:t xml:space="preserve">Orizon-Agents-BE-Stellar</w:t>
-      </w:r>
-      <w:r>
-        <w:t xml:space="preserve">, drop your worker into</w:t>
-      </w:r>
-      <w:r>
-        <w:t xml:space="preserve"> </w:t>
-      </w:r>
-      <w:r>
-        <w:rPr>
-          <w:rStyle w:val="VerbatimChar"/>
-        </w:rPr>
-        <w:t xml:space="preserve">backend/app/agents/workers/</w:t>
-      </w:r>
-      <w:r>
-        <w:t xml:space="preserve">, register it in</w:t>
-      </w:r>
-      <w:r>
-        <w:t xml:space="preserve"> </w:t>
-      </w:r>
-      <w:r>
-        <w:rPr>
-          <w:rStyle w:val="VerbatimChar"/>
-        </w:rPr>
-        <w:t xml:space="preserve">app/agents/registry.py</w:t>
-      </w:r>
-      <w:r>
-        <w:t xml:space="preserve">, and run</w:t>
-      </w:r>
-      <w:r>
-        <w:t xml:space="preserve"> </w:t>
-      </w:r>
-      <w:r>
-        <w:rPr>
-          <w:rStyle w:val="VerbatimChar"/>
-        </w:rPr>
-        <w:t xml:space="preserve">uvicorn app.main:app --reload</w:t>
-      </w:r>
-      <w:r>
-        <w:t xml:space="preserve"> </w:t>
-      </w:r>
-      <w:r>
-        <w:t xml:space="preserve">against your own copy.</w:t>
+        <w:t xml:space="preserve">2. Serve it where the backend can reach it.</w:t>
+      </w:r>
+      <w:r>
+        <w:t xml:space="preserve"> </w:t>
+      </w:r>
+      <w:r>
+        <w:t xml:space="preserve">Put it at a public HTTPS URL, and check the dispatch signature on each request so you know it came from Orizon (BE@a3dc1f9 · docs/operators/verifying-a-dispatch.md). A copyable reference agent that does this is EA@653664a · agent.py.</w:t>
       </w:r>
     </w:p>
     <w:p>
@@ -39195,7 +40133,16 @@
         <w:rPr>
           <w:rStyle w:val="StringTok"/>
         </w:rPr>
-        <w:t xml:space="preserve">'{ "owner": "G7…", "id": "agt_my", "name": "my.worker", "skills": ["code","ts"], "price": 0.020 }'</w:t>
+        <w:t xml:space="preserve">'{ "owner": "G…", "agent_id": "my_worker", "name": "my.worker",</w:t>
+      </w:r>
+      <w:r>
+        <w:br/>
+      </w:r>
+      <w:r>
+        <w:rPr>
+          <w:rStyle w:val="StringTok"/>
+        </w:rPr>
+        <w:t xml:space="preserve">        "skills": ["code","ts"], "price_usdc": 0.020 }'</w:t>
       </w:r>
       <w:r>
         <w:rPr>
@@ -39488,7 +40435,162 @@
         <w:t xml:space="preserve">AgentRegistry</w:t>
       </w:r>
       <w:r>
-        <w:t xml:space="preserve">.</w:t>
+        <w:t xml:space="preserve">. The request fields are</w:t>
+      </w:r>
+      <w:r>
+        <w:t xml:space="preserve"> </w:t>
+      </w:r>
+      <w:r>
+        <w:rPr>
+          <w:rStyle w:val="VerbatimChar"/>
+        </w:rPr>
+        <w:t xml:space="preserve">agent_id</w:t>
+      </w:r>
+      <w:r>
+        <w:t xml:space="preserve"> </w:t>
+      </w:r>
+      <w:r>
+        <w:t xml:space="preserve">and</w:t>
+      </w:r>
+      <w:r>
+        <w:t xml:space="preserve"> </w:t>
+      </w:r>
+      <w:r>
+        <w:rPr>
+          <w:rStyle w:val="VerbatimChar"/>
+        </w:rPr>
+        <w:t xml:space="preserve">price_usdc</w:t>
+      </w:r>
+      <w:r>
+        <w:t xml:space="preserve">, and an id starting</w:t>
+      </w:r>
+      <w:r>
+        <w:t xml:space="preserve"> </w:t>
+      </w:r>
+      <w:r>
+        <w:rPr>
+          <w:rStyle w:val="VerbatimChar"/>
+        </w:rPr>
+        <w:t xml:space="preserve">agt_</w:t>
+      </w:r>
+      <w:r>
+        <w:t xml:space="preserve"> </w:t>
+      </w:r>
+      <w:r>
+        <w:t xml:space="preserve">is refused with 409</w:t>
+      </w:r>
+      <w:r>
+        <w:t xml:space="preserve"> </w:t>
+      </w:r>
+      <w:r>
+        <w:rPr>
+          <w:rStyle w:val="VerbatimChar"/>
+        </w:rPr>
+        <w:t xml:space="preserve">id_reserved</w:t>
+      </w:r>
+      <w:r>
+        <w:t xml:space="preserve">, because the seeded catalogue owns that namespace (§6.2; BE@a3dc1f9 · app/routers/stellar.py ·</w:t>
+      </w:r>
+      <w:r>
+        <w:t xml:space="preserve"> </w:t>
+      </w:r>
+      <w:r>
+        <w:rPr>
+          <w:rStyle w:val="VerbatimChar"/>
+        </w:rPr>
+        <w:t xml:space="preserve">RegisterAgentReq</w:t>
+      </w:r>
+      <w:r>
+        <w:t xml:space="preserve">,</w:t>
+      </w:r>
+      <w:r>
+        <w:t xml:space="preserve"> </w:t>
+      </w:r>
+      <w:r>
+        <w:rPr>
+          <w:rStyle w:val="VerbatimChar"/>
+        </w:rPr>
+        <w:t xml:space="preserve">build_register_agent</w:t>
+      </w:r>
+      <w:r>
+        <w:t xml:space="preserve">). The dApp’s Register page builds and submits the same transaction (§6.3).</w:t>
+      </w:r>
+    </w:p>
+    <w:p>
+      <w:pPr>
+        <w:pStyle w:val="BodyText"/>
+      </w:pPr>
+      <w:r>
+        <w:t xml:space="preserve">Then bind your endpoint: sign the bind challenge for your endpoint URL with the owner wallet, on the dApp’s Bind page or through</w:t>
+      </w:r>
+      <w:r>
+        <w:t xml:space="preserve"> </w:t>
+      </w:r>
+      <w:r>
+        <w:rPr>
+          <w:rStyle w:val="VerbatimChar"/>
+        </w:rPr>
+        <w:t xml:space="preserve">POST /api/agents/{agent_id}/bind/challenge</w:t>
+      </w:r>
+      <w:r>
+        <w:t xml:space="preserve"> </w:t>
+      </w:r>
+      <w:r>
+        <w:t xml:space="preserve">and</w:t>
+      </w:r>
+      <w:r>
+        <w:t xml:space="preserve"> </w:t>
+      </w:r>
+      <w:r>
+        <w:rPr>
+          <w:rStyle w:val="VerbatimChar"/>
+        </w:rPr>
+        <w:t xml:space="preserve">POST /api/agents/{agent_id}/bind</w:t>
+      </w:r>
+      <w:r>
+        <w:t xml:space="preserve"> </w:t>
+      </w:r>
+      <w:r>
+        <w:t xml:space="preserve">(BE@a3dc1f9 · app/routers/binding.py ·</w:t>
+      </w:r>
+      <w:r>
+        <w:t xml:space="preserve"> </w:t>
+      </w:r>
+      <w:r>
+        <w:rPr>
+          <w:rStyle w:val="VerbatimChar"/>
+        </w:rPr>
+        <w:t xml:space="preserve">bind_challenge</w:t>
+      </w:r>
+      <w:r>
+        <w:t xml:space="preserve">,</w:t>
+      </w:r>
+      <w:r>
+        <w:t xml:space="preserve"> </w:t>
+      </w:r>
+      <w:r>
+        <w:rPr>
+          <w:rStyle w:val="VerbatimChar"/>
+        </w:rPr>
+        <w:t xml:space="preserve">bind</w:t>
+      </w:r>
+      <w:r>
+        <w:t xml:space="preserve">). Until it is bound, the house orchestrator leaves your agent out of its plans with the reason</w:t>
+      </w:r>
+      <w:r>
+        <w:t xml:space="preserve"> </w:t>
+      </w:r>
+      <w:r>
+        <w:rPr>
+          <w:rStyle w:val="VerbatimChar"/>
+        </w:rPr>
+        <w:t xml:space="preserve">unbound_endpoint</w:t>
+      </w:r>
+      <w:r>
+        <w:t xml:space="preserve"> </w:t>
+      </w:r>
+      <w:r>
+        <w:t xml:space="preserve">(§6.3).</w:t>
       </w:r>
     </w:p>
     <w:p>
@@ -39500,43 +40602,37 @@
           <w:b/>
           <w:bCs/>
         </w:rPr>
-        <w:t xml:space="preserve">5. Pass the reputation floor.</w:t>
-      </w:r>
-      <w:r>
-        <w:t xml:space="preserve"> </w:t>
-      </w:r>
-      <w:r>
-        <w:t xml:space="preserve">The house orchestrator routes by reputation; new agents start at zero. You can earn reputation by running test workflows against your agent directly (the orchestrator can be invoked with an explicit</w:t>
-      </w:r>
-      <w:r>
-        <w:t xml:space="preserve"> </w:t>
-      </w:r>
-      <w:r>
-        <w:rPr>
-          <w:rStyle w:val="VerbatimChar"/>
-        </w:rPr>
-        <w:t xml:space="preserve">agent_id</w:t>
-      </w:r>
-      <w:r>
-        <w:t xml:space="preserve"> </w:t>
-      </w:r>
-      <w:r>
-        <w:t xml:space="preserve">override) and accumulating positive ratings. Path to the public catalogue:</w:t>
-      </w:r>
-      <w:r>
-        <w:t xml:space="preserve"> </w:t>
-      </w:r>
-      <w:r>
-        <w:rPr>
-          <w:rStyle w:val="VerbatimChar"/>
-        </w:rPr>
-        <w:t xml:space="preserve">avg_bps ≥ 35,000</w:t>
-      </w:r>
-      <w:r>
-        <w:t xml:space="preserve"> </w:t>
-      </w:r>
-      <w:r>
-        <w:t xml:space="preserve">over at least 20 jobs (Blue belt).</w:t>
+        <w:t xml:space="preserve">5. Clear the reputation floor.</w:t>
+      </w:r>
+      <w:r>
+        <w:t xml:space="preserve"> </w:t>
+      </w:r>
+      <w:r>
+        <w:t xml:space="preserve">The house orchestrator routes on a floor of 5,500 bps applied to the lower bound of a prior-smoothed score, with no minimum job count. A new agent starts at the prior, a lower bound of 5,677 bps, so a bound agent is routable on its first request (§6.7; BE@a3dc1f9 · app/services/reputation_svc.py ·</w:t>
+      </w:r>
+      <w:r>
+        <w:t xml:space="preserve"> </w:t>
+      </w:r>
+      <w:r>
+        <w:rPr>
+          <w:rStyle w:val="VerbatimChar"/>
+        </w:rPr>
+        <w:t xml:space="preserve">passes_floor</w:t>
+      </w:r>
+      <w:r>
+        <w:t xml:space="preserve">,</w:t>
+      </w:r>
+      <w:r>
+        <w:t xml:space="preserve"> </w:t>
+      </w:r>
+      <w:r>
+        <w:rPr>
+          <w:rStyle w:val="VerbatimChar"/>
+        </w:rPr>
+        <w:t xml:space="preserve">cold_start_margin</w:t>
+      </w:r>
+      <w:r>
+        <w:t xml:space="preserve">). From then on the platform’s scorer rates each paid step your agent serves from what it returned, and a few poor ratings take it below the floor.</w:t>
       </w:r>
     </w:p>
     <w:p>
@@ -39548,28 +40644,55 @@
           <w:b/>
           <w:bCs/>
         </w:rPr>
-        <w:t xml:space="preserve">6. Wait for your first charge.</w:t>
-      </w:r>
-      <w:r>
-        <w:t xml:space="preserve"> </w:t>
-      </w:r>
-      <w:r>
-        <w:t xml:space="preserve">When the orchestrator routes a workflow to your agent, you’ll see USDC arrive in your owner wallet — one transfer per executed step, with the per-step amount and the workflow’s</w:t>
-      </w:r>
-      <w:r>
-        <w:t xml:space="preserve"> </w:t>
-      </w:r>
-      <w:r>
-        <w:rPr>
-          <w:rStyle w:val="VerbatimChar"/>
-        </w:rPr>
-        <w:t xml:space="preserve">job_id</w:t>
-      </w:r>
-      <w:r>
-        <w:t xml:space="preserve"> </w:t>
-      </w:r>
-      <w:r>
-        <w:t xml:space="preserve">as the memo.</w:t>
+        <w:t xml:space="preserve">6. Getting paid.</w:t>
+      </w:r>
+      <w:r>
+        <w:t xml:space="preserve"> </w:t>
+      </w:r>
+      <w:r>
+        <w:t xml:space="preserve">On the deployed v1 escrow no agent owner has yet been paid: its</w:t>
+      </w:r>
+      <w:r>
+        <w:t xml:space="preserve"> </w:t>
+      </w:r>
+      <w:r>
+        <w:rPr>
+          <w:rStyle w:val="VerbatimChar"/>
+        </w:rPr>
+        <w:t xml:space="preserve">charge</w:t>
+      </w:r>
+      <w:r>
+        <w:t xml:space="preserve"> </w:t>
+      </w:r>
+      <w:r>
+        <w:t xml:space="preserve">cannot complete (§6.9). Under escrow v2, merged but not deployed, one</w:t>
+      </w:r>
+      <w:r>
+        <w:t xml:space="preserve"> </w:t>
+      </w:r>
+      <w:r>
+        <w:rPr>
+          <w:rStyle w:val="VerbatimChar"/>
+        </w:rPr>
+        <w:t xml:space="preserve">settle</w:t>
+      </w:r>
+      <w:r>
+        <w:t xml:space="preserve"> </w:t>
+      </w:r>
+      <w:r>
+        <w:t xml:space="preserve">per workflow pays each delivered step’s price to the owner your agent’s registry entry names (SC@dd2d642 · contract/payment-escrow/src/lib.rs ·</w:t>
+      </w:r>
+      <w:r>
+        <w:t xml:space="preserve"> </w:t>
+      </w:r>
+      <w:r>
+        <w:rPr>
+          <w:rStyle w:val="VerbatimChar"/>
+        </w:rPr>
+        <w:t xml:space="preserve">PaymentEscrow::settle</w:t>
+      </w:r>
+      <w:r>
+        <w:t xml:space="preserve">).</w:t>
       </w:r>
     </w:p>
     <w:bookmarkEnd w:id="154"/>
@@ -39740,7 +40863,7 @@
         </w:numPr>
       </w:pPr>
       <w:r>
-        <w:t xml:space="preserve">Implement the equivalent execution loop yourself — call each agent’s HTTP endpoint, sign and submit</w:t>
+        <w:t xml:space="preserve">Implement the equivalent execution loop yourself — call each agent’s HTTP endpoint. You cannot settle or seal through the protocol’s deployed contracts from your own key:</w:t>
       </w:r>
       <w:r>
         <w:t xml:space="preserve"> </w:t>
@@ -39755,19 +40878,22 @@
         <w:t xml:space="preserve"> </w:t>
       </w:r>
       <w:r>
-        <w:t xml:space="preserve">per step against the buyer’s</w:t>
-      </w:r>
-      <w:r>
-        <w:t xml:space="preserve"> </w:t>
-      </w:r>
-      <w:r>
-        <w:rPr>
-          <w:rStyle w:val="VerbatimChar"/>
-        </w:rPr>
-        <w:t xml:space="preserve">auth_id</w:t>
-      </w:r>
-      <w:r>
-        <w:t xml:space="preserve">, sign and submit</w:t>
+        <w:t xml:space="preserve">(v1) and</w:t>
+      </w:r>
+      <w:r>
+        <w:t xml:space="preserve"> </w:t>
+      </w:r>
+      <w:r>
+        <w:rPr>
+          <w:rStyle w:val="VerbatimChar"/>
+        </w:rPr>
+        <w:t xml:space="preserve">settle</w:t>
+      </w:r>
+      <w:r>
+        <w:t xml:space="preserve"> </w:t>
+      </w:r>
+      <w:r>
+        <w:t xml:space="preserve">(v2) accept only the escrow’s settler, and</w:t>
       </w:r>
       <w:r>
         <w:t xml:space="preserve"> </w:t>
@@ -39782,7 +40908,7 @@
         <w:t xml:space="preserve"> </w:t>
       </w:r>
       <w:r>
-        <w:t xml:space="preserve">at the end. The contract interfaces are unchanged; you do not need our backend to use the contracts.</w:t>
+        <w:t xml:space="preserve">only the sealer, all keys the Blocksmiths operate (§6.1). An independent orchestrator that settles and seals on its own needs its own deployment of the contracts, with its own keys in those roles.</w:t>
       </w:r>
     </w:p>
     <w:p>
@@ -40031,29 +41157,13 @@
           <w:b/>
           <w:bCs/>
         </w:rPr>
-        <w:t xml:space="preserve">Skipping the rating step.</w:t>
-      </w:r>
-      <w:r>
-        <w:t xml:space="preserve"> </w:t>
-      </w:r>
-      <w:r>
-        <w:t xml:space="preserve">A successful workflow that does not produce a rating is</w:t>
-      </w:r>
-      <w:r>
-        <w:t xml:space="preserve"> </w:t>
-      </w:r>
-      <w:r>
-        <w:rPr>
-          <w:i/>
-          <w:iCs/>
-        </w:rPr>
-        <w:t xml:space="preserve">fine</w:t>
-      </w:r>
-      <w:r>
-        <w:t xml:space="preserve"> </w:t>
-      </w:r>
-      <w:r>
-        <w:t xml:space="preserve">— the settler emits a synthetic rating by default. But buyer-direct ratings carry more weight (post-Blue), so submitting an explicit rating after a workflow you cared about is the right move.</w:t>
+        <w:t xml:space="preserve">Looking for a rating step.</w:t>
+      </w:r>
+      <w:r>
+        <w:t xml:space="preserve"> </w:t>
+      </w:r>
+      <w:r>
+        <w:t xml:space="preserve">There is none for buyers. Only the platform’s scorer key writes ratings, one per step of a paid run, from the backend’s own record of what the step returned; the scorer is the backend’s signing key, not the deployed escrow’s settler (§6.1, §6.7). A buyer whose step did not deliver has one recourse: dispute it within 24 hours of settlement (§6.8).</w:t>
       </w:r>
     </w:p>
     <w:p>

</xml_diff>

<commit_message>
regenerated the litepaper docx for the re-priced fees
</commit_message>
<xml_diff>
--- a/litepaper/Orizon-Agents-Litepaper.docx
+++ b/litepaper/Orizon-Agents-Litepaper.docx
@@ -4238,7 +4238,7 @@
         <w:t xml:space="preserve">_submit_ratings</w:t>
       </w:r>
       <w:r>
-        <w:t xml:space="preserve">). Soroban calls cost far more than a classic payment’s 100 stroops: measured on testnet, about</w:t>
+        <w:t xml:space="preserve">). Soroban calls cost far more than a classic payment’s 100 stroops: measured on the escrow v2 team runs of 2026-09-30, about</w:t>
       </w:r>
       <w:r>
         <w:t xml:space="preserve"> </w:t>
@@ -4248,28 +4248,13 @@
           <w:b/>
           <w:bCs/>
         </w:rPr>
-        <w:t xml:space="preserve">0.127 XLM</w:t>
-      </w:r>
-      <w:r>
-        <w:t xml:space="preserve"> </w:t>
-      </w:r>
-      <w:r>
-        <w:t xml:space="preserve">for all nine, of which the</w:t>
-      </w:r>
-      <w:r>
-        <w:t xml:space="preserve"> </w:t>
-      </w:r>
-      <w:r>
-        <w:rPr>
-          <w:rStyle w:val="VerbatimChar"/>
-        </w:rPr>
-        <w:t xml:space="preserve">settle</w:t>
-      </w:r>
-      <w:r>
-        <w:t xml:space="preserve"> </w:t>
-      </w:r>
-      <w:r>
-        <w:t xml:space="preserve">is about 0.079 XLM, the mean of the first three escrow v2 settles on 2026-09-30 (§7.4). That is about 6.4 US cents at an assumed USD 0.50 per XLM (an assumption made on 2026-09-29, not a quote). The platform pays every one of those fees except the buyer’s</w:t>
+        <w:t xml:space="preserve">0.30 XLM</w:t>
+      </w:r>
+      <w:r>
+        <w:t xml:space="preserve"> </w:t>
+      </w:r>
+      <w:r>
+        <w:t xml:space="preserve">for all nine, or 0.91 XLM as sampled, a mean that includes one-off restores of archived ledger entries (§7.4). That is about 15 US cents, or 46 as sampled, at an assumed USD 0.50 per XLM (an assumption made on 2026-09-29, not a quote). The platform pays every one of those fees except the buyer’s</w:t>
       </w:r>
       <w:r>
         <w:t xml:space="preserve"> </w:t>
@@ -29592,7 +29577,34 @@
         <w:t xml:space="preserve">_submit_ratings</w:t>
       </w:r>
       <w:r>
-        <w:t xml:space="preserve">). The fee per call is measured on the testnet contracts, one transaction each:</w:t>
+        <w:t xml:space="preserve">). The fee per call is measured on the escrow v2 team runs of 2026-09-30, the six disclosed runs whose transactions are recorded in BE@ff8e5ea · docs/evidence/5.01/v2-team-runs/ (one</w:t>
+      </w:r>
+      <w:r>
+        <w:t xml:space="preserve"> </w:t>
+      </w:r>
+      <w:r>
+        <w:rPr>
+          <w:rStyle w:val="VerbatimChar"/>
+        </w:rPr>
+        <w:t xml:space="preserve">lifecycle.jsonl</w:t>
+      </w:r>
+      <w:r>
+        <w:t xml:space="preserve"> </w:t>
+      </w:r>
+      <w:r>
+        <w:t xml:space="preserve">per run), read from Horizon as each transaction’s</w:t>
+      </w:r>
+      <w:r>
+        <w:t xml:space="preserve"> </w:t>
+      </w:r>
+      <w:r>
+        <w:rPr>
+          <w:rStyle w:val="VerbatimChar"/>
+        </w:rPr>
+        <w:t xml:space="preserve">fee_charged</w:t>
+      </w:r>
+      <w:r>
+        <w:t xml:space="preserve">:</w:t>
       </w:r>
     </w:p>
     <w:tbl>
@@ -29656,7 +29668,7 @@
               <w:jc w:val="center"/>
             </w:pPr>
             <w:r>
-              <w:t xml:space="preserve">Stroops each (measured)</w:t>
+              <w:t xml:space="preserve">Stroops each: mean (min–max, samples)</w:t>
             </w:r>
           </w:p>
         </w:tc>
@@ -29726,7 +29738,7 @@
               <w:jc w:val="center"/>
             </w:pPr>
             <w:r>
-              <w:t xml:space="preserve">106,477</w:t>
+              <w:t xml:space="preserve">862,247 (784,169–1,249,256, n = 6)</w:t>
             </w:r>
           </w:p>
         </w:tc>
@@ -29738,7 +29750,7 @@
               <w:jc w:val="center"/>
             </w:pPr>
             <w:r>
-              <w:t xml:space="preserve">106.48 × 10⁶ stroops = 10.65</w:t>
+              <w:t xml:space="preserve">862.25 × 10⁶ stroops = 86.22</w:t>
             </w:r>
           </w:p>
         </w:tc>
@@ -29756,12 +29768,6 @@
               </w:rPr>
               <w:t xml:space="preserve">settle</w:t>
             </w:r>
-            <w:r>
-              <w:t xml:space="preserve"> </w:t>
-            </w:r>
-            <w:r>
-              <w:t xml:space="preserve">(v2)</w:t>
-            </w:r>
           </w:p>
         </w:tc>
         <w:tc>
@@ -29796,7 +29802,7 @@
               <w:jc w:val="center"/>
             </w:pPr>
             <w:r>
-              <w:t xml:space="preserve">790,647 (mean of 3)</w:t>
+              <w:t xml:space="preserve">790,647 (658,305–858,751, n = 3)</w:t>
             </w:r>
           </w:p>
         </w:tc>
@@ -29860,7 +29866,7 @@
               <w:jc w:val="center"/>
             </w:pPr>
             <w:r>
-              <w:t xml:space="preserve">57,926</w:t>
+              <w:t xml:space="preserve">6,222,403 (210,700–18,245,369, n = 3)</w:t>
             </w:r>
           </w:p>
         </w:tc>
@@ -29872,7 +29878,7 @@
               <w:jc w:val="center"/>
             </w:pPr>
             <w:r>
-              <w:t xml:space="preserve">57.93 × 10⁶ stroops = 5.79</w:t>
+              <w:t xml:space="preserve">6,222.40 × 10⁶ stroops = 622.24</w:t>
             </w:r>
           </w:p>
         </w:tc>
@@ -29930,7 +29936,7 @@
               <w:jc w:val="center"/>
             </w:pPr>
             <w:r>
-              <w:t xml:space="preserve">53,314</w:t>
+              <w:t xml:space="preserve">205,772 (85,685–302,591, n = 6)</w:t>
             </w:r>
           </w:p>
         </w:tc>
@@ -29942,7 +29948,7 @@
               <w:jc w:val="center"/>
             </w:pPr>
             <w:r>
-              <w:t xml:space="preserve">319.88 × 10⁶ stroops = 31.99</w:t>
+              <w:t xml:space="preserve">1,234.63 × 10⁶ stroops = 123.46</w:t>
             </w:r>
           </w:p>
         </w:tc>
@@ -29959,7 +29965,7 @@
                 <w:b/>
                 <w:bCs/>
               </w:rPr>
-              <w:t xml:space="preserve">Total network fee</w:t>
+              <w:t xml:space="preserve">Total, as sampled</w:t>
             </w:r>
           </w:p>
         </w:tc>
@@ -30019,7 +30025,84 @@
                 <w:b/>
                 <w:bCs/>
               </w:rPr>
-              <w:t xml:space="preserve">≈ 127.49 XLM</w:t>
+              <w:t xml:space="preserve">≈ 910.99 XLM</w:t>
+            </w:r>
+          </w:p>
+        </w:tc>
+      </w:tr>
+      <w:tr>
+        <w:tc>
+          <w:tcPr/>
+          <w:p>
+            <w:pPr>
+              <w:pStyle w:val="Compact"/>
+            </w:pPr>
+            <w:r>
+              <w:rPr>
+                <w:b/>
+                <w:bCs/>
+              </w:rPr>
+              <w:t xml:space="preserve">Total, without the archive restores</w:t>
+            </w:r>
+          </w:p>
+        </w:tc>
+        <w:tc>
+          <w:tcPr/>
+          <w:p>
+            <w:pPr>
+              <w:pStyle w:val="Compact"/>
+              <w:jc w:val="center"/>
+            </w:pPr>
+            <w:r>
+              <w:rPr>
+                <w:b/>
+                <w:bCs/>
+              </w:rPr>
+              <w:t xml:space="preserve">9</w:t>
+            </w:r>
+          </w:p>
+        </w:tc>
+        <w:tc>
+          <w:tcPr/>
+          <w:p>
+            <w:pPr>
+              <w:pStyle w:val="Compact"/>
+              <w:jc w:val="center"/>
+            </w:pPr>
+            <w:r>
+              <w:rPr>
+                <w:b/>
+                <w:bCs/>
+              </w:rPr>
+              <w:t xml:space="preserve">9,000</w:t>
+            </w:r>
+          </w:p>
+        </w:tc>
+        <w:tc>
+          <w:tcPr/>
+          <w:p>
+            <w:pPr>
+              <w:pStyle w:val="Compact"/>
+              <w:jc w:val="center"/>
+            </w:pPr>
+            <w:r>
+              <w:t xml:space="preserve">—</w:t>
+            </w:r>
+          </w:p>
+        </w:tc>
+        <w:tc>
+          <w:tcPr/>
+          <w:p>
+            <w:pPr>
+              <w:pStyle w:val="Compact"/>
+              <w:jc w:val="center"/>
+            </w:pPr>
+            <w:r>
+              <w:rPr>
+                <w:b/>
+                <w:bCs/>
+              </w:rPr>
+              <w:t xml:space="preserve">≈ 296.61 XLM</w:t>
             </w:r>
           </w:p>
         </w:tc>
@@ -30030,10 +30113,263 @@
         <w:pStyle w:val="BodyText"/>
       </w:pPr>
       <w:r>
-        <w:t xml:space="preserve">The samples are testnet transactions</w:t>
-      </w:r>
-      <w:r>
-        <w:t xml:space="preserve"> </w:t>
+        <w:t xml:space="preserve">The samples, all on 2026-09-30 between 09:29 and 09:39 UTC:</w:t>
+      </w:r>
+      <w:r>
+        <w:t xml:space="preserve"> </w:t>
+      </w:r>
+      <w:r>
+        <w:rPr>
+          <w:rStyle w:val="VerbatimChar"/>
+        </w:rPr>
+        <w:t xml:space="preserve">authorize</w:t>
+      </w:r>
+      <w:r>
+        <w:t xml:space="preserve"> </w:t>
+      </w:r>
+      <w:r>
+        <w:t xml:space="preserve">in all six runs (1,249,256; 784,169; 785,857; 784,171; 784,169; 785,859 stroops),</w:t>
+      </w:r>
+      <w:r>
+        <w:t xml:space="preserve"> </w:t>
+      </w:r>
+      <w:r>
+        <w:rPr>
+          <w:rStyle w:val="VerbatimChar"/>
+        </w:rPr>
+        <w:t xml:space="preserve">settle</w:t>
+      </w:r>
+      <w:r>
+        <w:t xml:space="preserve"> </w:t>
+      </w:r>
+      <w:r>
+        <w:t xml:space="preserve">and</w:t>
+      </w:r>
+      <w:r>
+        <w:t xml:space="preserve"> </w:t>
+      </w:r>
+      <w:r>
+        <w:rPr>
+          <w:rStyle w:val="VerbatimChar"/>
+        </w:rPr>
+        <w:t xml:space="preserve">seal</w:t>
+      </w:r>
+      <w:r>
+        <w:t xml:space="preserve"> </w:t>
+      </w:r>
+      <w:r>
+        <w:t xml:space="preserve">in the three healthy runs (settles</w:t>
+      </w:r>
+      <w:r>
+        <w:t xml:space="preserve"> </w:t>
+      </w:r>
+      <w:r>
+        <w:rPr>
+          <w:rStyle w:val="VerbatimChar"/>
+        </w:rPr>
+        <w:t xml:space="preserve">f0674419…1235</w:t>
+      </w:r>
+      <w:r>
+        <w:t xml:space="preserve"> </w:t>
+      </w:r>
+      <w:r>
+        <w:t xml:space="preserve">858,751,</w:t>
+      </w:r>
+      <w:r>
+        <w:t xml:space="preserve"> </w:t>
+      </w:r>
+      <w:r>
+        <w:rPr>
+          <w:rStyle w:val="VerbatimChar"/>
+        </w:rPr>
+        <w:t xml:space="preserve">19f3420d…3397</w:t>
+      </w:r>
+      <w:r>
+        <w:t xml:space="preserve"> </w:t>
+      </w:r>
+      <w:r>
+        <w:t xml:space="preserve">854,885 and</w:t>
+      </w:r>
+      <w:r>
+        <w:t xml:space="preserve"> </w:t>
+      </w:r>
+      <w:r>
+        <w:rPr>
+          <w:rStyle w:val="VerbatimChar"/>
+        </w:rPr>
+        <w:t xml:space="preserve">785428bf…554b</w:t>
+      </w:r>
+      <w:r>
+        <w:t xml:space="preserve"> </w:t>
+      </w:r>
+      <w:r>
+        <w:t xml:space="preserve">658,305; seals 18,245,369, 210,700 and 211,139), and one rating</w:t>
+      </w:r>
+      <w:r>
+        <w:t xml:space="preserve"> </w:t>
+      </w:r>
+      <w:r>
+        <w:rPr>
+          <w:rStyle w:val="VerbatimChar"/>
+        </w:rPr>
+        <w:t xml:space="preserve">submit</w:t>
+      </w:r>
+      <w:r>
+        <w:t xml:space="preserve"> </w:t>
+      </w:r>
+      <w:r>
+        <w:t xml:space="preserve">per run (296,690; 296,691; 167,290 for the healthy runs; 302,591; 85,685; 85,685 for the faulty agent’s). The means are 5,173,481 / 6 = 862,247 for</w:t>
+      </w:r>
+      <w:r>
+        <w:t xml:space="preserve"> </w:t>
+      </w:r>
+      <w:r>
+        <w:rPr>
+          <w:rStyle w:val="VerbatimChar"/>
+        </w:rPr>
+        <w:t xml:space="preserve">authorize</w:t>
+      </w:r>
+      <w:r>
+        <w:t xml:space="preserve">, 2,371,941 / 3 = 790,647 for</w:t>
+      </w:r>
+      <w:r>
+        <w:t xml:space="preserve"> </w:t>
+      </w:r>
+      <w:r>
+        <w:rPr>
+          <w:rStyle w:val="VerbatimChar"/>
+        </w:rPr>
+        <w:t xml:space="preserve">settle</w:t>
+      </w:r>
+      <w:r>
+        <w:t xml:space="preserve">, 18,667,208 / 3 = 6,222,403 for</w:t>
+      </w:r>
+      <w:r>
+        <w:t xml:space="preserve"> </w:t>
+      </w:r>
+      <w:r>
+        <w:rPr>
+          <w:rStyle w:val="VerbatimChar"/>
+        </w:rPr>
+        <w:t xml:space="preserve">seal</w:t>
+      </w:r>
+      <w:r>
+        <w:t xml:space="preserve"> </w:t>
+      </w:r>
+      <w:r>
+        <w:t xml:space="preserve">and 1,234,632 / 6 = 205,772 for</w:t>
+      </w:r>
+      <w:r>
+        <w:t xml:space="preserve"> </w:t>
+      </w:r>
+      <w:r>
+        <w:rPr>
+          <w:rStyle w:val="VerbatimChar"/>
+        </w:rPr>
+        <w:t xml:space="preserve">submit</w:t>
+      </w:r>
+      <w:r>
+        <w:t xml:space="preserve">, rounded to the stroop. A workflow therefore costs 862,247 + 790,647 + 6,222,403 + 6 × 205,772 = 9,109,929 stroops, about 0.91 XLM, and 1,000 of them cost 9,109,929,000 stroops, 910.99 XLM.</w:t>
+      </w:r>
+    </w:p>
+    <w:p>
+      <w:pPr>
+        <w:pStyle w:val="BodyText"/>
+      </w:pPr>
+      <w:r>
+        <w:t xml:space="preserve">Three caveats. First, the sample is small and the means carry one-off costs. Three of the transactions restored archived ledger entries before running, which Soroban charges for: the first</w:t>
+      </w:r>
+      <w:r>
+        <w:t xml:space="preserve"> </w:t>
+      </w:r>
+      <w:r>
+        <w:rPr>
+          <w:rStyle w:val="VerbatimChar"/>
+        </w:rPr>
+        <w:t xml:space="preserve">seal</w:t>
+      </w:r>
+      <w:r>
+        <w:t xml:space="preserve"> </w:t>
+      </w:r>
+      <w:r>
+        <w:t xml:space="preserve">(</w:t>
+      </w:r>
+      <w:r>
+        <w:rPr>
+          <w:rStyle w:val="VerbatimChar"/>
+        </w:rPr>
+        <w:t xml:space="preserve">f0b25fc5…2b5c</w:t>
+      </w:r>
+      <w:r>
+        <w:t xml:space="preserve">, 18,245,369 stroops) and the first two settles. A steady stream of workflows would not pay that on every call. Without those three samples,</w:t>
+      </w:r>
+      <w:r>
+        <w:t xml:space="preserve"> </w:t>
+      </w:r>
+      <w:r>
+        <w:rPr>
+          <w:rStyle w:val="VerbatimChar"/>
+        </w:rPr>
+        <w:t xml:space="preserve">settle</w:t>
+      </w:r>
+      <w:r>
+        <w:t xml:space="preserve"> </w:t>
+      </w:r>
+      <w:r>
+        <w:t xml:space="preserve">is 658,305 (n = 1) and</w:t>
+      </w:r>
+      <w:r>
+        <w:t xml:space="preserve"> </w:t>
+      </w:r>
+      <w:r>
+        <w:rPr>
+          <w:rStyle w:val="VerbatimChar"/>
+        </w:rPr>
+        <w:t xml:space="preserve">seal</w:t>
+      </w:r>
+      <w:r>
+        <w:t xml:space="preserve"> </w:t>
+      </w:r>
+      <w:r>
+        <w:t xml:space="preserve">is (210,700 + 211,139) / 2 = 210,920 (n = 2), so a workflow costs 862,247 + 658,305 + 210,920 + 1,234,632 = 2,966,104 stroops, about 0.30 XLM, and 1,000 cost 296.61 XLM. The rating mean still includes each agent’s first rating, which writes its first evidence and costs more (296,690 to 302,591, against 85,685 to 167,290 afterwards). Second, every sampled settle paid one delivered step to one owner. A settle with six payouts writes more, and has not been measured. Third, fees move with the network:</w:t>
+      </w:r>
+      <w:r>
+        <w:t xml:space="preserve"> </w:t>
+      </w:r>
+      <w:r>
+        <w:rPr>
+          <w:rStyle w:val="VerbatimChar"/>
+        </w:rPr>
+        <w:t xml:space="preserve">fee_charged</w:t>
+      </w:r>
+      <w:r>
+        <w:t xml:space="preserve"> </w:t>
+      </w:r>
+      <w:r>
+        <w:t xml:space="preserve">includes an inclusion fee that rises under surge pricing, and all the samples come from ten minutes of one testnet day.</w:t>
+      </w:r>
+    </w:p>
+    <w:p>
+      <w:pPr>
+        <w:pStyle w:val="BodyText"/>
+      </w:pPr>
+      <w:r>
+        <w:t xml:space="preserve">Before 2026-09-30 this table was priced from v1-era samples, for example a v1</w:t>
+      </w:r>
+      <w:r>
+        <w:t xml:space="preserve"> </w:t>
+      </w:r>
+      <w:r>
+        <w:rPr>
+          <w:rStyle w:val="VerbatimChar"/>
+        </w:rPr>
+        <w:t xml:space="preserve">authorize</w:t>
+      </w:r>
+      <w:r>
+        <w:t xml:space="preserve"> </w:t>
+      </w:r>
+      <w:r>
+        <w:t xml:space="preserve">at 106,477 stroops (</w:t>
       </w:r>
       <w:r>
         <w:rPr>
@@ -30042,10 +30378,10 @@
         <w:t xml:space="preserve">027b0d42…9230</w:t>
       </w:r>
       <w:r>
-        <w:t xml:space="preserve"> </w:t>
-      </w:r>
-      <w:r>
-        <w:t xml:space="preserve">(</w:t>
+        <w:t xml:space="preserve">, 2026-09-22). Those figures are history: a v2</w:t>
+      </w:r>
+      <w:r>
+        <w:t xml:space="preserve"> </w:t>
       </w:r>
       <w:r>
         <w:rPr>
@@ -30054,181 +30390,18 @@
         <w:t xml:space="preserve">authorize</w:t>
       </w:r>
       <w:r>
-        <w:t xml:space="preserve">, 2026-09-22),</w:t>
-      </w:r>
-      <w:r>
-        <w:t xml:space="preserve"> </w:t>
-      </w:r>
-      <w:r>
-        <w:rPr>
-          <w:rStyle w:val="VerbatimChar"/>
-        </w:rPr>
-        <w:t xml:space="preserve">03c3f815…67b7</w:t>
-      </w:r>
-      <w:r>
-        <w:t xml:space="preserve"> </w:t>
-      </w:r>
-      <w:r>
-        <w:t xml:space="preserve">(</w:t>
-      </w:r>
-      <w:r>
-        <w:rPr>
-          <w:rStyle w:val="VerbatimChar"/>
-        </w:rPr>
-        <w:t xml:space="preserve">seal</w:t>
-      </w:r>
-      <w:r>
-        <w:t xml:space="preserve">, 2026-06-09) and</w:t>
-      </w:r>
-      <w:r>
-        <w:t xml:space="preserve"> </w:t>
-      </w:r>
-      <w:r>
-        <w:rPr>
-          <w:rStyle w:val="VerbatimChar"/>
-        </w:rPr>
-        <w:t xml:space="preserve">63031b49…28b2</w:t>
-      </w:r>
-      <w:r>
-        <w:t xml:space="preserve"> </w:t>
-      </w:r>
-      <w:r>
-        <w:t xml:space="preserve">(</w:t>
-      </w:r>
-      <w:r>
-        <w:rPr>
-          <w:rStyle w:val="VerbatimChar"/>
-        </w:rPr>
-        <w:t xml:space="preserve">submit</w:t>
-      </w:r>
-      <w:r>
-        <w:t xml:space="preserve">, 2026-09-22), and for</w:t>
-      </w:r>
-      <w:r>
-        <w:t xml:space="preserve"> </w:t>
-      </w:r>
-      <w:r>
-        <w:rPr>
-          <w:rStyle w:val="VerbatimChar"/>
-        </w:rPr>
-        <w:t xml:space="preserve">settle</w:t>
-      </w:r>
-      <w:r>
-        <w:t xml:space="preserve"> </w:t>
-      </w:r>
-      <w:r>
-        <w:t xml:space="preserve">the first three escrow v2 settles, all on 2026-09-30, whose fees Horizon reports as</w:t>
-      </w:r>
-      <w:r>
-        <w:t xml:space="preserve"> </w:t>
-      </w:r>
-      <w:r>
-        <w:rPr>
-          <w:rStyle w:val="VerbatimChar"/>
-        </w:rPr>
-        <w:t xml:space="preserve">fee_charged</w:t>
-      </w:r>
-      <w:r>
-        <w:t xml:space="preserve">:</w:t>
-      </w:r>
-      <w:r>
-        <w:t xml:space="preserve"> </w:t>
-      </w:r>
-      <w:r>
-        <w:rPr>
-          <w:rStyle w:val="VerbatimChar"/>
-        </w:rPr>
-        <w:t xml:space="preserve">f0674419…1235</w:t>
-      </w:r>
-      <w:r>
-        <w:t xml:space="preserve"> </w:t>
-      </w:r>
-      <w:r>
-        <w:t xml:space="preserve">(858,751 stroops),</w:t>
-      </w:r>
-      <w:r>
-        <w:t xml:space="preserve"> </w:t>
-      </w:r>
-      <w:r>
-        <w:rPr>
-          <w:rStyle w:val="VerbatimChar"/>
-        </w:rPr>
-        <w:t xml:space="preserve">19f3420d…3397</w:t>
-      </w:r>
-      <w:r>
-        <w:t xml:space="preserve"> </w:t>
-      </w:r>
-      <w:r>
-        <w:t xml:space="preserve">(854,885) and</w:t>
-      </w:r>
-      <w:r>
-        <w:t xml:space="preserve"> </w:t>
-      </w:r>
-      <w:r>
-        <w:rPr>
-          <w:rStyle w:val="VerbatimChar"/>
-        </w:rPr>
-        <w:t xml:space="preserve">785428bf…554b</w:t>
-      </w:r>
-      <w:r>
-        <w:t xml:space="preserve"> </w:t>
-      </w:r>
-      <w:r>
-        <w:t xml:space="preserve">(658,305). Their mean is (858,751 + 854,885 + 658,305) / 3 = 2,371,941 / 3 = 790,647 stroops, so 1,000 settles a month cost 1,000 × 790,647 stroops = 790.65 × 10⁶ stroops = 79.06 XLM. Each of those settles paid one delivered step to one owner; a settle that pays six owners writes more, and has not been measured.</w:t>
-      </w:r>
-      <w:r>
-        <w:t xml:space="preserve"> </w:t>
-      </w:r>
-      <w:r>
-        <w:rPr>
-          <w:rStyle w:val="VerbatimChar"/>
-        </w:rPr>
-        <w:t xml:space="preserve">settle</w:t>
-      </w:r>
-      <w:r>
-        <w:t xml:space="preserve"> </w:t>
-      </w:r>
-      <w:r>
-        <w:t xml:space="preserve">is now the largest line, about fourteen times the v1</w:t>
-      </w:r>
-      <w:r>
-        <w:t xml:space="preserve"> </w:t>
-      </w:r>
-      <w:r>
-        <w:rPr>
-          <w:rStyle w:val="VerbatimChar"/>
-        </w:rPr>
-        <w:t xml:space="preserve">charge</w:t>
-      </w:r>
-      <w:r>
-        <w:t xml:space="preserve"> </w:t>
-      </w:r>
-      <w:r>
-        <w:t xml:space="preserve">it replaces (790,647 / 54,989 ≈ 14.4;</w:t>
-      </w:r>
-      <w:r>
-        <w:t xml:space="preserve"> </w:t>
-      </w:r>
-      <w:r>
-        <w:rPr>
-          <w:rStyle w:val="VerbatimChar"/>
-        </w:rPr>
-        <w:t xml:space="preserve">7932846b…9cc2</w:t>
-      </w:r>
-      <w:r>
-        <w:t xml:space="preserve">, 2026-06-09). The other rows are samples taken before escrow v2 went live, and are not re-priced here: the first v2 runs paid more for</w:t>
-      </w:r>
-      <w:r>
-        <w:t xml:space="preserve"> </w:t>
-      </w:r>
-      <w:r>
-        <w:rPr>
-          <w:rStyle w:val="VerbatimChar"/>
-        </w:rPr>
-        <w:t xml:space="preserve">authorize</w:t>
-      </w:r>
-      <w:r>
-        <w:t xml:space="preserve">, which under v2 also moves the buyer’s funds into custody, at 784,169 to 1,249,256 stroops. A rating that writes an agent’s first evidence costs more, up to 189,423 stroops in the scorer’s recent history. The total is 106,477,000 + 790,647,000 + 57,926,000 + 319,884,000 = 1,274,934,000 stroops, or 127.49 XLM. At an assumed USD 0.50 per XLM (an assumption made on 2026-09-29, not a quote), the monthly network cost across 1,000 workflows is therefore about</w:t>
+        <w:t xml:space="preserve"> </w:t>
+      </w:r>
+      <w:r>
+        <w:t xml:space="preserve">also moves the buyer’s funds into custody.</w:t>
+      </w:r>
+    </w:p>
+    <w:p>
+      <w:pPr>
+        <w:pStyle w:val="BodyText"/>
+      </w:pPr>
+      <w:r>
+        <w:t xml:space="preserve">At an assumed USD 0.50 per XLM (an assumption made on 2026-09-29, not a quote), the monthly network cost across 1,000 workflows is therefore about</w:t>
       </w:r>
       <w:r>
         <w:t xml:space="preserve"> </w:t>
@@ -30238,13 +30411,13 @@
           <w:b/>
           <w:bCs/>
         </w:rPr>
-        <w:t xml:space="preserve">USD 64</w:t>
-      </w:r>
-      <w:r>
-        <w:t xml:space="preserve"> </w:t>
-      </w:r>
-      <w:r>
-        <w:t xml:space="preserve">(127.49 × 0.50 = 63.75). The agent payouts of ≈ 172 USDC flow entirely through to agent owners; the protocol takes zero margin in v1.</w:t>
+        <w:t xml:space="preserve">USD 148</w:t>
+      </w:r>
+      <w:r>
+        <w:t xml:space="preserve"> </w:t>
+      </w:r>
+      <w:r>
+        <w:t xml:space="preserve">without the archive restores (296.61 × 0.50 = 148.31), and about USD 455 as sampled (910.99 × 0.50 = 455.50). The agent payouts of ≈ 172 USDC flow entirely through to agent owners; the protocol takes zero margin in v1.</w:t>
       </w:r>
     </w:p>
     <w:p>
@@ -30286,22 +30459,7 @@
         <w:t xml:space="preserve"> </w:t>
       </w:r>
       <w:r>
-        <w:t xml:space="preserve">fees, about 1.06 XLM at the table’s sample (10 × 106,477 stroops), or about USD 0.53 at the assumed USD 0.50 per XLM, and more at the v2</w:t>
-      </w:r>
-      <w:r>
-        <w:t xml:space="preserve"> </w:t>
-      </w:r>
-      <w:r>
-        <w:rPr>
-          <w:rStyle w:val="VerbatimChar"/>
-        </w:rPr>
-        <w:t xml:space="preserve">authorize</w:t>
-      </w:r>
-      <w:r>
-        <w:t xml:space="preserve"> </w:t>
-      </w:r>
-      <w:r>
-        <w:t xml:space="preserve">fees above; the platform pays the rest of the network fees.</w:t>
+        <w:t xml:space="preserve">fees, about 0.86 XLM at the measured mean (10 × 862,247 stroops = 8,622,470 stroops), or about USD 0.43 at the assumed USD 0.50 per XLM; the platform pays the rest of the network fees.</w:t>
       </w:r>
     </w:p>
     <w:p>
@@ -30323,7 +30481,7 @@
         <w:t xml:space="preserve"> </w:t>
       </w:r>
       <w:r>
-        <w:t xml:space="preserve">The chain part is measured above: about USD 64 a month for 1,000 workflows at the assumed rate, nearly all of it paid by the platform. The inference part is not measured: the protocol covers OpenAI for the orchestrator and the live workers, and this document states no per-workflow inference cost, so we do not claim which of the two is larger. An operator running their own deployment can substitute a self-hosted model, which moves the inference cost to their own hardware.</w:t>
+        <w:t xml:space="preserve">The chain part is measured above: about USD 148 a month for 1,000 workflows at the assumed rate without the one-off archive restores, and USD 455 as sampled, nearly all of it paid by the platform. The inference part is not measured: the protocol covers OpenAI for the orchestrator and the live workers, and this document states no per-workflow inference cost, so we do not claim which of the two is larger. An operator running their own deployment can substitute a self-hosted model, which moves the inference cost to their own hardware.</w:t>
       </w:r>
     </w:p>
     <w:bookmarkEnd w:id="91"/>

</xml_diff>